<commit_message>
feat: Noite 6 - troca role-play e duelo por porteiro vivo (DHCP encenado) e cartaz da rede
Co-Authored-By: Claude Opus 5.5 <noreply@anthropic.com>
Claude-Session: https://claude.ai/code/session_014d2FCU4ZD84rtzS7r1bjwe
</commit_message>
<xml_diff>
--- a/Roteiro - Redes 6 - Endereco na rede.docx
+++ b/Roteiro - Redes 6 - Endereco na rede.docx
@@ -189,7 +189,7 @@
         <w:rPr>
           <w:sz w:val="22"/>
         </w:rPr>
-        <w:t>Um roteador extra, "sabotado", para a Estação B do Bloco 7 (ver abaixo)</w:t>
+        <w:t>Um roteador extra, "sabotado", para a Estação B do Bloco 8 (ver abaixo)</w:t>
       </w:r>
     </w:p>
     <w:p>
@@ -238,6 +238,30 @@
           <w:sz w:val="22"/>
         </w:rPr>
         <w:t>Régua de tomadas</w:t>
+      </w:r>
+    </w:p>
+    <w:p>
+      <w:pPr>
+        <w:pStyle w:val="ListBullet"/>
+        <w:spacing w:after="40"/>
+      </w:pPr>
+      <w:r>
+        <w:rPr>
+          <w:sz w:val="22"/>
+        </w:rPr>
+        <w:t>Pro porteiro vivo (Bloco 5): uma prancheta ou caderno pro porteiro, fita crepe pra fazer crachás</w:t>
+      </w:r>
+    </w:p>
+    <w:p>
+      <w:pPr>
+        <w:pStyle w:val="ListBullet"/>
+        <w:spacing w:after="40"/>
+      </w:pPr>
+      <w:r>
+        <w:rPr>
+          <w:sz w:val="22"/>
+        </w:rPr>
+        <w:t>Pro cartaz (Bloco 9): uma folha de papel pardo ou cartolina por equipe, canetões de 3 cores (preto, vermelho, verde)</w:t>
       </w:r>
     </w:p>
     <w:p>
@@ -299,7 +323,7 @@
         <w:rPr>
           <w:sz w:val="22"/>
         </w:rPr>
-        <w:t>Escolha uma senha de administrador igual pra todos (ex.: redes2026). Os alunos vão criá-la no primeiro acesso ao painel, no Bloco 5</w:t>
+        <w:t>Escolha uma senha de administrador igual pra todos (ex.: redes2026). Os alunos vão criá-la no primeiro acesso ao painel, no Bloco 6</w:t>
       </w:r>
     </w:p>
     <w:p>
@@ -499,6 +523,18 @@
           <w:sz w:val="22"/>
         </w:rPr>
         <w:t>Resumo do aluno, uma por pessoa (pra levar pra casa)</w:t>
+      </w:r>
+    </w:p>
+    <w:p>
+      <w:pPr>
+        <w:pStyle w:val="ListBullet"/>
+        <w:spacing w:after="40"/>
+      </w:pPr>
+      <w:r>
+        <w:rPr>
+          <w:sz w:val="22"/>
+        </w:rPr>
+        <w:t>O ANEXO no fim deste roteiro: o Livro da portaria (1 cópia) e os cartões de MAC (recorte, 1 por aluno)</w:t>
       </w:r>
     </w:p>
     <w:p>
@@ -654,7 +690,7 @@
               <w:rPr>
                 <w:sz w:val="20"/>
               </w:rPr>
-              <w:t>20 min</w:t>
+              <w:t>15 min</w:t>
             </w:r>
           </w:p>
         </w:tc>
@@ -742,7 +778,7 @@
               <w:rPr>
                 <w:sz w:val="20"/>
               </w:rPr>
-              <w:t>15 min</w:t>
+              <w:t>10 min</w:t>
             </w:r>
           </w:p>
         </w:tc>
@@ -757,6 +793,50 @@
                 <w:sz w:val="20"/>
               </w:rPr>
               <w:t>DHCP, gateway, IP público</w:t>
+            </w:r>
+          </w:p>
+        </w:tc>
+      </w:tr>
+      <w:tr>
+        <w:tc>
+          <w:tcPr>
+            <w:tcW w:type="dxa" w:w="3685"/>
+          </w:tcPr>
+          <w:p>
+            <w:r/>
+            <w:r>
+              <w:rPr>
+                <w:sz w:val="20"/>
+              </w:rPr>
+              <w:t>5. PRÁTICA — O porteiro vivo</w:t>
+            </w:r>
+          </w:p>
+        </w:tc>
+        <w:tc>
+          <w:tcPr>
+            <w:tcW w:type="dxa" w:w="1134"/>
+          </w:tcPr>
+          <w:p>
+            <w:r/>
+            <w:r>
+              <w:rPr>
+                <w:sz w:val="20"/>
+              </w:rPr>
+              <w:t>25 min</w:t>
+            </w:r>
+          </w:p>
+        </w:tc>
+        <w:tc>
+          <w:tcPr>
+            <w:tcW w:type="dxa" w:w="4535"/>
+          </w:tcPr>
+          <w:p>
+            <w:r/>
+            <w:r>
+              <w:rPr>
+                <w:sz w:val="20"/>
+              </w:rPr>
+              <w:t>A turma encena o DHCP: chegada, volta, lotação, porteiro de folga, conflito</w:t>
             </w:r>
           </w:p>
         </w:tc>
@@ -815,7 +895,7 @@
               <w:rPr>
                 <w:sz w:val="20"/>
               </w:rPr>
-              <w:t>5. PRÁTICA — Quem está na rede?</w:t>
+              <w:t>6. PRÁTICA — Quem está na rede?</w:t>
             </w:r>
           </w:p>
         </w:tc>
@@ -859,7 +939,7 @@
               <w:rPr>
                 <w:sz w:val="20"/>
               </w:rPr>
-              <w:t>6. PRÁTICA — Caça ao intruso</w:t>
+              <w:t>7. PRÁTICA — Caça ao intruso</w:t>
             </w:r>
           </w:p>
         </w:tc>
@@ -903,7 +983,7 @@
               <w:rPr>
                 <w:sz w:val="20"/>
               </w:rPr>
-              <w:t>7. PRÁTICA — Ping e o sem-endereço</w:t>
+              <w:t>8. PRÁTICA — Ping e o sem-endereço</w:t>
             </w:r>
           </w:p>
         </w:tc>
@@ -947,7 +1027,7 @@
               <w:rPr>
                 <w:sz w:val="20"/>
               </w:rPr>
-              <w:t>8. Chamados em role-play</w:t>
+              <w:t>9. PRÁTICA — O cartaz da rede</w:t>
             </w:r>
           </w:p>
         </w:tc>
@@ -961,7 +1041,7 @@
               <w:rPr>
                 <w:sz w:val="20"/>
               </w:rPr>
-              <w:t>20 min</w:t>
+              <w:t>25 min</w:t>
             </w:r>
           </w:p>
         </w:tc>
@@ -975,51 +1055,7 @@
               <w:rPr>
                 <w:sz w:val="20"/>
               </w:rPr>
-              <w:t>Conectado sem internet, impressora sumida, vizinho no Wi-Fi</w:t>
-            </w:r>
-          </w:p>
-        </w:tc>
-      </w:tr>
-      <w:tr>
-        <w:tc>
-          <w:tcPr>
-            <w:tcW w:type="dxa" w:w="3685"/>
-          </w:tcPr>
-          <w:p>
-            <w:r/>
-            <w:r>
-              <w:rPr>
-                <w:sz w:val="20"/>
-              </w:rPr>
-              <w:t>9. Duelo relâmpago</w:t>
-            </w:r>
-          </w:p>
-        </w:tc>
-        <w:tc>
-          <w:tcPr>
-            <w:tcW w:type="dxa" w:w="1134"/>
-          </w:tcPr>
-          <w:p>
-            <w:r/>
-            <w:r>
-              <w:rPr>
-                <w:sz w:val="20"/>
-              </w:rPr>
-              <w:t>15 min</w:t>
-            </w:r>
-          </w:p>
-        </w:tc>
-        <w:tc>
-          <w:tcPr>
-            <w:tcW w:type="dxa" w:w="4535"/>
-          </w:tcPr>
-          <w:p>
-            <w:r/>
-            <w:r>
-              <w:rPr>
-                <w:sz w:val="20"/>
-              </w:rPr>
-              <w:t>Time A × Time B</w:t>
+              <w:t>Cada equipe desenha a própria rede e apresenta pra turma</w:t>
             </w:r>
           </w:p>
         </w:tc>
@@ -1049,7 +1085,7 @@
               <w:rPr>
                 <w:sz w:val="20"/>
               </w:rPr>
-              <w:t>15 min</w:t>
+              <w:t>10 min</w:t>
             </w:r>
           </w:p>
         </w:tc>
@@ -1080,7 +1116,7 @@
           <w:color w:val="555555"/>
           <w:sz w:val="22"/>
         </w:rPr>
-        <w:t>Blocos 3, 5, 6, 7, 8 e 9: 130 min de atividade do aluno (62% do total), mais o censo do Bloco 1. A exposição está em dois blocos curtos (35 min somados), separados por prática.</w:t>
+        <w:t>Blocos 3, 5, 6, 7, 8 e 9: 145 min de atividade do aluno (69% do total), mais o censo do Bloco 1. A exposição está em dois blocos curtos (25 min somados), cada um seguido de prática.</w:t>
       </w:r>
     </w:p>
     <w:p>
@@ -1282,7 +1318,7 @@
           <w:color w:val="0B5C5C"/>
           <w:sz w:val="30"/>
         </w:rPr>
-        <w:t>BLOCO 2 — DOIS DOCUMENTOS: MAC E IP · 20 MIN</w:t>
+        <w:t>BLOCO 2 — DOIS DOCUMENTOS: MAC E IP · 15 MIN</w:t>
       </w:r>
     </w:p>
     <w:p>
@@ -1321,7 +1357,7 @@
           <w:color w:val="0B5C5C"/>
           <w:sz w:val="24"/>
         </w:rPr>
-        <w:t>O condomínio — 12 min</w:t>
+        <w:t>O condomínio — 8 min</w:t>
       </w:r>
     </w:p>
     <w:p>
@@ -1647,7 +1683,7 @@
           <w:color w:val="0B5C5C"/>
           <w:sz w:val="24"/>
         </w:rPr>
-        <w:t>O aviso de campo — 5 min</w:t>
+        <w:t>O aviso de campo — 4 min</w:t>
       </w:r>
     </w:p>
     <w:p>
@@ -1890,7 +1926,7 @@
           <w:color w:val="0B5C5C"/>
           <w:sz w:val="30"/>
         </w:rPr>
-        <w:t>BLOCO 4 — QUEM DÁ O ENDEREÇO + IP DE DENTRO E DE FORA · 15 MIN</w:t>
+        <w:t>BLOCO 4 — QUEM DÁ O ENDEREÇO + IP DE DENTRO E DE FORA · 10 MIN</w:t>
       </w:r>
     </w:p>
     <w:p>
@@ -1939,6 +1975,18 @@
         <w:rPr>
           <w:sz w:val="22"/>
         </w:rPr>
+        <w:t>Não se demore aqui: no Bloco 5 a turma vai ENCENAR o porteiro. O entendimento vem de lá</w:t>
+      </w:r>
+    </w:p>
+    <w:p>
+      <w:pPr>
+        <w:pStyle w:val="ListBullet"/>
+        <w:spacing w:after="40"/>
+      </w:pPr>
+      <w:r>
+        <w:rPr>
+          <w:sz w:val="22"/>
+        </w:rPr>
         <w:t>Se o porteiro não responde, o aparelho fica sem endereço. O Windows, aí, inventa um número que começa com 169.254. "Quando vocês virem 169.254, já sabem: ninguém deu endereço pra esse aparelho"</w:t>
       </w:r>
     </w:p>
@@ -1952,7 +2000,7 @@
           <w:color w:val="0B5C5C"/>
           <w:sz w:val="24"/>
         </w:rPr>
-        <w:t>IP de dentro e IP de fora — 10 min</w:t>
+        <w:t>IP de dentro e IP de fora — 5 min</w:t>
       </w:r>
     </w:p>
     <w:p>
@@ -2019,6 +2067,516 @@
       <w:r>
         <w:rPr>
           <w:b/>
+          <w:color w:val="0B5C5C"/>
+          <w:sz w:val="30"/>
+        </w:rPr>
+        <w:t>BLOCO 5 — PRÁTICA · O PORTEIRO VIVO · 25 MIN</w:t>
+      </w:r>
+    </w:p>
+    <w:p>
+      <w:pPr>
+        <w:spacing w:after="80"/>
+      </w:pPr>
+      <w:r>
+        <w:rPr>
+          <w:b w:val="0"/>
+          <w:i w:val="0"/>
+          <w:sz w:val="22"/>
+        </w:rPr>
+        <w:t>A turma encena o DHCP. Ninguém fica sentado. Use o Livro da portaria e os cartões de MAC do ANEXO.</w:t>
+      </w:r>
+    </w:p>
+    <w:p>
+      <w:pPr>
+        <w:spacing w:before="200" w:after="120"/>
+      </w:pPr>
+      <w:r>
+        <w:rPr>
+          <w:b/>
+          <w:color w:val="0B5C5C"/>
+          <w:sz w:val="24"/>
+        </w:rPr>
+        <w:t>Montagem — 3 min</w:t>
+      </w:r>
+    </w:p>
+    <w:p>
+      <w:pPr>
+        <w:pStyle w:val="ListBullet"/>
+        <w:spacing w:after="40"/>
+      </w:pPr>
+      <w:r>
+        <w:rPr>
+          <w:sz w:val="22"/>
+        </w:rPr>
+        <w:t>Um aluno é o PORTEIRO (o roteador). Fica numa mesa na porta da sala, com o Livro da portaria</w:t>
+      </w:r>
+    </w:p>
+    <w:p>
+      <w:pPr>
+        <w:pStyle w:val="ListBullet"/>
+        <w:spacing w:after="40"/>
+      </w:pPr>
+      <w:r>
+        <w:rPr>
+          <w:sz w:val="22"/>
+        </w:rPr>
+        <w:t>Cada outro aluno recebe um cartão de MAC — é o "CPF" do aparelho dele. Todos saem pro corredor (ou pro fundo da sala)</w:t>
+      </w:r>
+    </w:p>
+    <w:p>
+      <w:pPr>
+        <w:pStyle w:val="ListBullet"/>
+        <w:spacing w:after="40"/>
+      </w:pPr>
+      <w:r>
+        <w:rPr>
+          <w:sz w:val="22"/>
+        </w:rPr>
+        <w:t>No Livro, deixe 2 apartamentos a MENOS que o número de alunos. Risque as linhas que sobrarem. É de propósito (rodada 3)</w:t>
+      </w:r>
+    </w:p>
+    <w:p>
+      <w:pPr>
+        <w:spacing w:before="200" w:after="120"/>
+      </w:pPr>
+      <w:r>
+        <w:rPr>
+          <w:b/>
+          <w:color w:val="0B5C5C"/>
+          <w:sz w:val="24"/>
+        </w:rPr>
+        <w:t>As rodadas</w:t>
+      </w:r>
+    </w:p>
+    <w:p>
+      <w:pPr>
+        <w:spacing w:after="80"/>
+      </w:pPr>
+      <w:r>
+        <w:rPr>
+          <w:b w:val="0"/>
+          <w:i/>
+          <w:color w:val="555555"/>
+          <w:sz w:val="22"/>
+        </w:rPr>
+        <w:t>Troque o porteiro a cada rodada. Depois de cada uma, pare e pergunte: "isso acontece de verdade quando?"</w:t>
+      </w:r>
+    </w:p>
+    <w:tbl>
+      <w:tblPr>
+        <w:tblStyle w:val="LightGrid-Accent1"/>
+        <w:tblW w:type="auto" w:w="0"/>
+        <w:tblLook w:firstColumn="1" w:firstRow="1" w:lastColumn="0" w:lastRow="0" w:noHBand="0" w:noVBand="1" w:val="04A0"/>
+      </w:tblPr>
+      <w:tblGrid>
+        <w:gridCol w:w="3324"/>
+        <w:gridCol w:w="3324"/>
+        <w:gridCol w:w="3324"/>
+      </w:tblGrid>
+      <w:tr>
+        <w:tc>
+          <w:tcPr>
+            <w:tcW w:type="dxa" w:w="1474"/>
+            <w:shd w:val="clear" w:color="auto" w:fill="0B5C5C"/>
+          </w:tcPr>
+          <w:p>
+            <w:r/>
+            <w:r>
+              <w:rPr>
+                <w:b/>
+                <w:color w:val="FFFFFF"/>
+                <w:sz w:val="20"/>
+              </w:rPr>
+              <w:t>Rodada</w:t>
+            </w:r>
+          </w:p>
+        </w:tc>
+        <w:tc>
+          <w:tcPr>
+            <w:tcW w:type="dxa" w:w="4762"/>
+            <w:shd w:val="clear" w:color="auto" w:fill="0B5C5C"/>
+          </w:tcPr>
+          <w:p>
+            <w:r/>
+            <w:r>
+              <w:rPr>
+                <w:b/>
+                <w:color w:val="FFFFFF"/>
+                <w:sz w:val="20"/>
+              </w:rPr>
+              <w:t>O que acontece</w:t>
+            </w:r>
+          </w:p>
+        </w:tc>
+        <w:tc>
+          <w:tcPr>
+            <w:tcW w:type="dxa" w:w="3118"/>
+            <w:shd w:val="clear" w:color="auto" w:fill="0B5C5C"/>
+          </w:tcPr>
+          <w:p>
+            <w:r/>
+            <w:r>
+              <w:rPr>
+                <w:b/>
+                <w:color w:val="FFFFFF"/>
+                <w:sz w:val="20"/>
+              </w:rPr>
+              <w:t>A lição</w:t>
+            </w:r>
+          </w:p>
+        </w:tc>
+      </w:tr>
+      <w:tr>
+        <w:tc>
+          <w:tcPr>
+            <w:tcW w:type="dxa" w:w="1474"/>
+          </w:tcPr>
+          <w:p>
+            <w:r/>
+            <w:r>
+              <w:rPr>
+                <w:sz w:val="20"/>
+              </w:rPr>
+              <w:t>1. Chegada</w:t>
+            </w:r>
+          </w:p>
+        </w:tc>
+        <w:tc>
+          <w:tcPr>
+            <w:tcW w:type="dxa" w:w="4762"/>
+          </w:tcPr>
+          <w:p>
+            <w:r/>
+            <w:r>
+              <w:rPr>
+                <w:sz w:val="20"/>
+              </w:rPr>
+              <w:t>Cada um chega e diz: "Meu MAC é ___. Alguém me dá um endereço?" O porteiro anota o MAC ao lado do primeiro apartamento livre e escreve no crachá (fita crepe): o IP e "portaria 192.168.0.1"</w:t>
+            </w:r>
+          </w:p>
+        </w:tc>
+        <w:tc>
+          <w:tcPr>
+            <w:tcW w:type="dxa" w:w="3118"/>
+          </w:tcPr>
+          <w:p>
+            <w:r/>
+            <w:r>
+              <w:rPr>
+                <w:sz w:val="20"/>
+              </w:rPr>
+              <w:t>O DHCP dá IP, gateway e anota quem recebeu</w:t>
+            </w:r>
+          </w:p>
+        </w:tc>
+      </w:tr>
+      <w:tr>
+        <w:tc>
+          <w:tcPr>
+            <w:tcW w:type="dxa" w:w="1474"/>
+          </w:tcPr>
+          <w:p>
+            <w:r/>
+            <w:r>
+              <w:rPr>
+                <w:sz w:val="20"/>
+              </w:rPr>
+              <w:t>2. Sai e volta</w:t>
+            </w:r>
+          </w:p>
+        </w:tc>
+        <w:tc>
+          <w:tcPr>
+            <w:tcW w:type="dxa" w:w="4762"/>
+          </w:tcPr>
+          <w:p>
+            <w:r/>
+            <w:r>
+              <w:rPr>
+                <w:sz w:val="20"/>
+              </w:rPr>
+              <w:t>Três alunos saem da sala e voltam. O porteiro procura o MAC no Livro e devolve o MESMO apartamento</w:t>
+            </w:r>
+          </w:p>
+        </w:tc>
+        <w:tc>
+          <w:tcPr>
+            <w:tcW w:type="dxa" w:w="3118"/>
+          </w:tcPr>
+          <w:p>
+            <w:r/>
+            <w:r>
+              <w:rPr>
+                <w:sz w:val="20"/>
+              </w:rPr>
+              <w:t>O roteador lembra do aparelho pelo MAC</w:t>
+            </w:r>
+          </w:p>
+        </w:tc>
+      </w:tr>
+      <w:tr>
+        <w:tc>
+          <w:tcPr>
+            <w:tcW w:type="dxa" w:w="1474"/>
+          </w:tcPr>
+          <w:p>
+            <w:r/>
+            <w:r>
+              <w:rPr>
+                <w:sz w:val="20"/>
+              </w:rPr>
+              <w:t>3. Lotação</w:t>
+            </w:r>
+          </w:p>
+        </w:tc>
+        <w:tc>
+          <w:tcPr>
+            <w:tcW w:type="dxa" w:w="4762"/>
+          </w:tcPr>
+          <w:p>
+            <w:r/>
+            <w:r>
+              <w:rPr>
+                <w:sz w:val="20"/>
+              </w:rPr>
+              <w:t>Os últimos a chegar não acham apartamento livre. Escrevem no crachá: 169.254</w:t>
+            </w:r>
+          </w:p>
+        </w:tc>
+        <w:tc>
+          <w:tcPr>
+            <w:tcW w:type="dxa" w:w="3118"/>
+          </w:tcPr>
+          <w:p>
+            <w:r/>
+            <w:r>
+              <w:rPr>
+                <w:sz w:val="20"/>
+              </w:rPr>
+              <w:t>Sem endereço disponível = sem rede</w:t>
+            </w:r>
+          </w:p>
+        </w:tc>
+      </w:tr>
+      <w:tr>
+        <w:tc>
+          <w:tcPr>
+            <w:tcW w:type="dxa" w:w="1474"/>
+          </w:tcPr>
+          <w:p>
+            <w:r/>
+            <w:r>
+              <w:rPr>
+                <w:sz w:val="20"/>
+              </w:rPr>
+              <w:t>4. MAC aleatório</w:t>
+            </w:r>
+          </w:p>
+        </w:tc>
+        <w:tc>
+          <w:tcPr>
+            <w:tcW w:type="dxa" w:w="4762"/>
+          </w:tcPr>
+          <w:p>
+            <w:r/>
+            <w:r>
+              <w:rPr>
+                <w:sz w:val="20"/>
+              </w:rPr>
+              <w:t>Dois alunos trocam de cartão de MAC entre si e voltam. O porteiro não reconhece e dá outro apartamento (ou nenhum, se lotado)</w:t>
+            </w:r>
+          </w:p>
+        </w:tc>
+        <w:tc>
+          <w:tcPr>
+            <w:tcW w:type="dxa" w:w="3118"/>
+          </w:tcPr>
+          <w:p>
+            <w:r/>
+            <w:r>
+              <w:rPr>
+                <w:sz w:val="20"/>
+              </w:rPr>
+              <w:t>Celular com MAC aleatório pode ganhar IP novo</w:t>
+            </w:r>
+          </w:p>
+        </w:tc>
+      </w:tr>
+      <w:tr>
+        <w:tc>
+          <w:tcPr>
+            <w:tcW w:type="dxa" w:w="1474"/>
+          </w:tcPr>
+          <w:p>
+            <w:r/>
+            <w:r>
+              <w:rPr>
+                <w:sz w:val="20"/>
+              </w:rPr>
+              <w:t>5. Porteiro de folga</w:t>
+            </w:r>
+          </w:p>
+        </w:tc>
+        <w:tc>
+          <w:tcPr>
+            <w:tcW w:type="dxa" w:w="4762"/>
+          </w:tcPr>
+          <w:p>
+            <w:r/>
+            <w:r>
+              <w:rPr>
+                <w:sz w:val="20"/>
+              </w:rPr>
+              <w:t>O porteiro sai da mesa. Quem chegar agora fica com 169.254</w:t>
+            </w:r>
+          </w:p>
+        </w:tc>
+        <w:tc>
+          <w:tcPr>
+            <w:tcW w:type="dxa" w:w="3118"/>
+          </w:tcPr>
+          <w:p>
+            <w:r/>
+            <w:r>
+              <w:rPr>
+                <w:sz w:val="20"/>
+              </w:rPr>
+              <w:t>É a Estação B que vocês vão ver depois do intervalo</w:t>
+            </w:r>
+          </w:p>
+        </w:tc>
+      </w:tr>
+      <w:tr>
+        <w:tc>
+          <w:tcPr>
+            <w:tcW w:type="dxa" w:w="1474"/>
+          </w:tcPr>
+          <w:p>
+            <w:r/>
+            <w:r>
+              <w:rPr>
+                <w:sz w:val="20"/>
+              </w:rPr>
+              <w:t>6. A encomenda</w:t>
+            </w:r>
+          </w:p>
+        </w:tc>
+        <w:tc>
+          <w:tcPr>
+            <w:tcW w:type="dxa" w:w="4762"/>
+          </w:tcPr>
+          <w:p>
+            <w:r/>
+            <w:r>
+              <w:rPr>
+                <w:sz w:val="20"/>
+              </w:rPr>
+              <w:t>Você entrega ao porteiro um papel: "Vídeo para 192.168.0.104". Ele olha o Livro e leva até o apartamento certo</w:t>
+            </w:r>
+          </w:p>
+        </w:tc>
+        <w:tc>
+          <w:tcPr>
+            <w:tcW w:type="dxa" w:w="3118"/>
+          </w:tcPr>
+          <w:p>
+            <w:r/>
+            <w:r>
+              <w:rPr>
+                <w:sz w:val="20"/>
+              </w:rPr>
+              <w:t>É assim que o vídeo acha o celular certo — a pergunta do Bloco 2</w:t>
+            </w:r>
+          </w:p>
+        </w:tc>
+      </w:tr>
+      <w:tr>
+        <w:tc>
+          <w:tcPr>
+            <w:tcW w:type="dxa" w:w="1474"/>
+          </w:tcPr>
+          <w:p>
+            <w:r/>
+            <w:r>
+              <w:rPr>
+                <w:sz w:val="20"/>
+              </w:rPr>
+              <w:t>7. O espertinho</w:t>
+            </w:r>
+          </w:p>
+        </w:tc>
+        <w:tc>
+          <w:tcPr>
+            <w:tcW w:type="dxa" w:w="4762"/>
+          </w:tcPr>
+          <w:p>
+            <w:r/>
+            <w:r>
+              <w:rPr>
+                <w:sz w:val="20"/>
+              </w:rPr>
+              <w:t>Um aluno, sem passar na portaria, escreve no crachá um IP que JÁ É de outro colega. Chega outra encomenda pra esse número: o porteiro não sabe pra qual dos dois entregar</w:t>
+            </w:r>
+          </w:p>
+        </w:tc>
+        <w:tc>
+          <w:tcPr>
+            <w:tcW w:type="dxa" w:w="3118"/>
+          </w:tcPr>
+          <w:p>
+            <w:r/>
+            <w:r>
+              <w:rPr>
+                <w:sz w:val="20"/>
+              </w:rPr>
+              <w:t>Conflito de IP: acontece quando alguém digita IP fixo na mão</w:t>
+            </w:r>
+          </w:p>
+        </w:tc>
+      </w:tr>
+    </w:tbl>
+    <w:p>
+      <w:pPr>
+        <w:spacing w:after="80"/>
+      </w:pPr>
+      <w:r>
+        <w:rPr>
+          <w:b w:val="0"/>
+          <w:i/>
+          <w:color w:val="E88B1A"/>
+          <w:sz w:val="22"/>
+        </w:rPr>
+        <w:t>Onde dilatar: depois da rodada 7, peça pra turma inventar uma rodada nova que represente algum problema real. Deixe que encenem. Depois, pergunte: "o que o técnico faria pra resolver?" (aumentar os apartamentos, reiniciar o porteiro, apagar o IP fixo).</w:t>
+      </w:r>
+    </w:p>
+    <w:p>
+      <w:pPr>
+        <w:spacing w:after="80"/>
+      </w:pPr>
+      <w:r>
+        <w:rPr>
+          <w:b w:val="0"/>
+          <w:i/>
+          <w:color w:val="0B5C5C"/>
+          <w:sz w:val="22"/>
+        </w:rPr>
+        <w:t>Guarde o Livro preenchido da rodada 1. Ele é a "lista de clientes DHCP" de papel — logo depois do intervalo, eles veem a mesma lista na tela do roteador.</w:t>
+      </w:r>
+    </w:p>
+    <w:p>
+      <w:pPr>
+        <w:pBdr>
+          <w:bottom w:val="single" w:sz="6" w:space="1" w:color="888888"/>
+        </w:pBdr>
+      </w:pPr>
+    </w:p>
+    <w:p>
+      <w:pPr>
+        <w:spacing w:before="280" w:after="120"/>
+      </w:pPr>
+      <w:r>
+        <w:rPr>
+          <w:b/>
           <w:color w:val="555555"/>
           <w:sz w:val="30"/>
         </w:rPr>
@@ -2042,7 +2600,7 @@
           <w:color w:val="0B5C5C"/>
           <w:sz w:val="30"/>
         </w:rPr>
-        <w:t>BLOCO 5 — PRÁTICA · QUEM ESTÁ NA REDE? · 35 MIN</w:t>
+        <w:t>BLOCO 6 — PRÁTICA · QUEM ESTÁ NA REDE? · 35 MIN</w:t>
       </w:r>
     </w:p>
     <w:p>
@@ -2055,7 +2613,7 @@
           <w:i w:val="0"/>
           <w:sz w:val="22"/>
         </w:rPr>
-        <w:t>A atividade principal da noite. Cada equipe entra no painel do SEU roteador e descobre quem é cada aparelho conectado. Página 2 da folha.</w:t>
+        <w:t>A atividade principal da noite. Cada equipe entra no painel do SEU roteador e descobre quem é cada aparelho conectado. Página 2 da folha. Abra com: "Lembram do Livro da portaria? O roteador tem um igual. Vamos ver."</w:t>
       </w:r>
     </w:p>
     <w:p>
@@ -2277,7 +2835,7 @@
           <w:color w:val="0B5C5C"/>
           <w:sz w:val="30"/>
         </w:rPr>
-        <w:t>BLOCO 6 — PRÁTICA · CAÇA AO INTRUSO · 15 MIN</w:t>
+        <w:t>BLOCO 7 — PRÁTICA · CAÇA AO INTRUSO · 15 MIN</w:t>
       </w:r>
     </w:p>
     <w:p>
@@ -2290,7 +2848,7 @@
           <w:i w:val="0"/>
           <w:sz w:val="22"/>
         </w:rPr>
-        <w:t>Durante o Bloco 5, sem ninguém ver, conecte o seu celular (o "intruso") no Wi-Fi de uma equipe — a senha está na etiqueta embaixo do roteador. Se der, conecte também um aparelho de outra equipe noutra rede.</w:t>
+        <w:t>Durante o Bloco 6, sem ninguém ver, conecte o seu celular (o "intruso") no Wi-Fi de uma equipe — a senha está na etiqueta embaixo do roteador. Se der, conecte também um aparelho de outra equipe noutra rede.</w:t>
       </w:r>
     </w:p>
     <w:p>
@@ -2372,7 +2930,7 @@
           <w:color w:val="0B5C5C"/>
           <w:sz w:val="30"/>
         </w:rPr>
-        <w:t>BLOCO 7 — PRÁTICA · PING E O SEM-ENDEREÇO · 25 MIN</w:t>
+        <w:t>BLOCO 8 — PRÁTICA · PING E O SEM-ENDEREÇO · 25 MIN</w:t>
       </w:r>
     </w:p>
     <w:p>
@@ -2521,7 +3079,7 @@
         <w:rPr>
           <w:sz w:val="22"/>
         </w:rPr>
-        <w:t>A equipe escreve o diagnóstico. Depois você conta o segredo: o porteiro (DHCP) estava de folga</w:t>
+        <w:t>A equipe escreve o diagnóstico. Depois você conta o segredo: o porteiro (DHCP) estava de folga — igual à rodada 5</w:t>
       </w:r>
     </w:p>
     <w:p>
@@ -2623,7 +3181,7 @@
           <w:color w:val="0B5C5C"/>
           <w:sz w:val="30"/>
         </w:rPr>
-        <w:t>BLOCO 8 — CHAMADOS EM ROLE-PLAY · 20 MIN</w:t>
+        <w:t>BLOCO 9 — PRÁTICA · O CARTAZ DA REDE · 25 MIN</w:t>
       </w:r>
     </w:p>
     <w:p>
@@ -2636,7 +3194,284 @@
           <w:i w:val="0"/>
           <w:sz w:val="22"/>
         </w:rPr>
-        <w:t>Duplas: um cliente, um técnico. O técnico diz o que faria, passo a passo, usando o que viu hoje. Troca os papéis a cada chamado. Chamados na página 3 da folha:</w:t>
+        <w:t>Cada equipe desenha, num papel pardo ou cartolina, o "condomínio" da rede que ela investigou hoje. Depois cola na parede e apresenta.</w:t>
+      </w:r>
+    </w:p>
+    <w:p>
+      <w:pPr>
+        <w:spacing w:before="200" w:after="120"/>
+      </w:pPr>
+      <w:r>
+        <w:rPr>
+          <w:b/>
+          <w:color w:val="0B5C5C"/>
+          <w:sz w:val="24"/>
+        </w:rPr>
+        <w:t>O que o cartaz precisa ter — 12 min pra fazer</w:t>
+      </w:r>
+    </w:p>
+    <w:p>
+      <w:pPr>
+        <w:pStyle w:val="ListBullet"/>
+        <w:spacing w:after="40"/>
+      </w:pPr>
+      <w:r>
+        <w:rPr>
+          <w:sz w:val="22"/>
+        </w:rPr>
+        <w:t>No meio, o roteador: modelo, MAC da etiqueta e o número da portaria (gateway)</w:t>
+      </w:r>
+    </w:p>
+    <w:p>
+      <w:pPr>
+        <w:pStyle w:val="ListBullet"/>
+        <w:spacing w:after="40"/>
+      </w:pPr>
+      <w:r>
+        <w:rPr>
+          <w:sz w:val="22"/>
+        </w:rPr>
+        <w:t>Em volta, cada aparelho da equipe: dono, nome que aparecia na lista, IP e MAC. Marque com um ★ quem estava com MAC aleatório</w:t>
+      </w:r>
+    </w:p>
+    <w:p>
+      <w:pPr>
+        <w:pStyle w:val="ListBullet"/>
+        <w:spacing w:after="40"/>
+      </w:pPr>
+      <w:r>
+        <w:rPr>
+          <w:sz w:val="22"/>
+        </w:rPr>
+        <w:t>Em VERMELHO: o intruso, se a rede da equipe foi invadida. Se não foi, um aparelho que poderia ter entrado e como</w:t>
+      </w:r>
+    </w:p>
+    <w:p>
+      <w:pPr>
+        <w:pStyle w:val="ListBullet"/>
+        <w:spacing w:after="40"/>
+      </w:pPr>
+      <w:r>
+        <w:rPr>
+          <w:sz w:val="22"/>
+        </w:rPr>
+        <w:t>Em VERDE, fora do prédio: a rua, com o IP de fora ("o provedor dá") e uma seta até a portaria</w:t>
+      </w:r>
+    </w:p>
+    <w:p>
+      <w:pPr>
+        <w:pStyle w:val="ListBullet"/>
+        <w:spacing w:after="40"/>
+      </w:pPr>
+      <w:r>
+        <w:rPr>
+          <w:sz w:val="22"/>
+        </w:rPr>
+        <w:t>Num canto: "O que seria 169.254 aqui?" — a equipe escreve em uma frase quando essa rede ficaria sem endereço</w:t>
+      </w:r>
+    </w:p>
+    <w:p>
+      <w:pPr>
+        <w:spacing w:before="200" w:after="120"/>
+      </w:pPr>
+      <w:r>
+        <w:rPr>
+          <w:b/>
+          <w:color w:val="0B5C5C"/>
+          <w:sz w:val="24"/>
+        </w:rPr>
+        <w:t>Apresentação — ~3 min por equipe</w:t>
+      </w:r>
+    </w:p>
+    <w:p>
+      <w:pPr>
+        <w:pStyle w:val="ListBullet"/>
+        <w:spacing w:after="40"/>
+      </w:pPr>
+      <w:r>
+        <w:rPr>
+          <w:sz w:val="22"/>
+        </w:rPr>
+        <w:t>Cada membro da equipe fala uma parte do cartaz — ninguém apresenta sozinho</w:t>
+      </w:r>
+    </w:p>
+    <w:p>
+      <w:pPr>
+        <w:pStyle w:val="ListBullet"/>
+        <w:spacing w:after="40"/>
+      </w:pPr>
+      <w:r>
+        <w:rPr>
+          <w:sz w:val="22"/>
+        </w:rPr>
+        <w:t>Depois de cada apresentação, a turma faz UMA pergunta pra equipe. Se ninguém perguntar, você pergunta: "se faltar luz agora e o roteador reiniciar, o celular do fulano continua com o mesmo IP?" ou "como vocês provariam que esse aparelho é mesmo do fulano?"</w:t>
+      </w:r>
+    </w:p>
+    <w:p>
+      <w:pPr>
+        <w:spacing w:after="80"/>
+      </w:pPr>
+      <w:r>
+        <w:rPr>
+          <w:b w:val="0"/>
+          <w:i/>
+          <w:color w:val="E88B1A"/>
+          <w:sz w:val="22"/>
+        </w:rPr>
+        <w:t>Onde dilatar: a turma vota o cartaz mais claro — "se um técnico novo chegasse amanhã, com qual cartaz ele entenderia a rede mais rápido?". Guarde os cartazes: na Noite 8 eles são o ponto de partida da planta de instalação.</w:t>
+      </w:r>
+    </w:p>
+    <w:p>
+      <w:pPr>
+        <w:pBdr>
+          <w:bottom w:val="single" w:sz="6" w:space="1" w:color="888888"/>
+        </w:pBdr>
+      </w:pPr>
+    </w:p>
+    <w:p>
+      <w:pPr>
+        <w:spacing w:before="280" w:after="120"/>
+      </w:pPr>
+      <w:r>
+        <w:rPr>
+          <w:b/>
+          <w:color w:val="0B5C5C"/>
+          <w:sz w:val="30"/>
+        </w:rPr>
+        <w:t>BLOCO 10 — FECHAMENTO E TAREFA · 10 MIN</w:t>
+      </w:r>
+    </w:p>
+    <w:p>
+      <w:pPr>
+        <w:spacing w:before="200" w:after="120"/>
+      </w:pPr>
+      <w:r>
+        <w:rPr>
+          <w:b/>
+          <w:color w:val="0B5C5C"/>
+          <w:sz w:val="24"/>
+        </w:rPr>
+        <w:t>Quiz de saída</w:t>
+      </w:r>
+    </w:p>
+    <w:p>
+      <w:pPr>
+        <w:pStyle w:val="ListBullet"/>
+        <w:spacing w:after="40"/>
+      </w:pPr>
+      <w:r>
+        <w:rPr>
+          <w:sz w:val="22"/>
+        </w:rPr>
+        <w:t>Diferença entre IP e MAC, numa frase cada</w:t>
+      </w:r>
+    </w:p>
+    <w:p>
+      <w:pPr>
+        <w:pStyle w:val="ListBullet"/>
+        <w:spacing w:after="40"/>
+      </w:pPr>
+      <w:r>
+        <w:rPr>
+          <w:sz w:val="22"/>
+        </w:rPr>
+        <w:t>O que é o gateway e qual o número dele na rede de hoje?</w:t>
+      </w:r>
+    </w:p>
+    <w:p>
+      <w:pPr>
+        <w:pStyle w:val="ListBullet"/>
+        <w:spacing w:after="40"/>
+      </w:pPr>
+      <w:r>
+        <w:rPr>
+          <w:sz w:val="22"/>
+        </w:rPr>
+        <w:t>O que o 169.254 conta pro técnico?</w:t>
+      </w:r>
+    </w:p>
+    <w:p>
+      <w:pPr>
+        <w:pStyle w:val="ListBullet"/>
+        <w:spacing w:after="40"/>
+      </w:pPr>
+      <w:r>
+        <w:rPr>
+          <w:sz w:val="22"/>
+        </w:rPr>
+        <w:t>Como você descobre se tem aparelho estranho no Wi-Fi do cliente?</w:t>
+      </w:r>
+    </w:p>
+    <w:p>
+      <w:pPr>
+        <w:spacing w:before="200" w:after="120"/>
+      </w:pPr>
+      <w:r>
+        <w:rPr>
+          <w:b/>
+          <w:color w:val="0B5C5C"/>
+          <w:sz w:val="24"/>
+        </w:rPr>
+        <w:t>A tarefa</w:t>
+      </w:r>
+    </w:p>
+    <w:p>
+      <w:pPr>
+        <w:spacing w:after="80"/>
+      </w:pPr>
+      <w:r>
+        <w:rPr>
+          <w:b w:val="0"/>
+          <w:i/>
+          <w:sz w:val="22"/>
+        </w:rPr>
+        <w:t>"Hoje a gente digitou 192.168.0.1 no navegador. Mas ninguém digita 142.250.… pra entrar no Google — digita google.com.br. Quem transforma o nome em número? Isso é a Noite 7. A tarefa: no celular, abra três sites que você usa e anote o endereço completo que aparece na barra lá em cima — com o https:// e tudo. Repare se aparece um cadeado."</w:t>
+      </w:r>
+    </w:p>
+    <w:p>
+      <w:pPr>
+        <w:spacing w:before="200" w:after="120"/>
+      </w:pPr>
+      <w:r>
+        <w:rPr>
+          <w:b/>
+          <w:color w:val="0B5C5C"/>
+          <w:sz w:val="24"/>
+        </w:rPr>
+        <w:t>Anuncie a próxima</w:t>
+      </w:r>
+    </w:p>
+    <w:p>
+      <w:pPr>
+        <w:spacing w:after="80"/>
+      </w:pPr>
+      <w:r>
+        <w:rPr>
+          <w:b w:val="0"/>
+          <w:i/>
+          <w:sz w:val="22"/>
+        </w:rPr>
+        <w:t>"Na próxima noite: nomes na rede. Por que às vezes o WhatsApp funciona e o site não abre, o que é aquele cadeado do navegador e como reconhecer um site falso pelo endereço."</w:t>
+      </w:r>
+    </w:p>
+    <w:p>
+      <w:pPr>
+        <w:pBdr>
+          <w:bottom w:val="single" w:sz="6" w:space="1" w:color="888888"/>
+        </w:pBdr>
+      </w:pPr>
+    </w:p>
+    <w:p>
+      <w:pPr>
+        <w:spacing w:before="280" w:after="120"/>
+      </w:pPr>
+      <w:r>
+        <w:rPr>
+          <w:b/>
+          <w:color w:val="0B5C5C"/>
+          <w:sz w:val="30"/>
+        </w:rPr>
+        <w:t>SE PERGUNTAREM</w:t>
       </w:r>
     </w:p>
     <w:p>
@@ -2649,7 +3484,7 @@
           <w:i w:val="0"/>
           <w:sz w:val="22"/>
         </w:rPr>
-        <w:t>"O computador diz 'conectado, sem internet'. O cabo é novo, a luz acende."</w:t>
+        <w:t>"Dá pra descobrir onde a pessoa mora pelo IP?"</w:t>
       </w:r>
     </w:p>
     <w:p>
@@ -2660,64 +3495,9 @@
         <w:rPr>
           <w:b w:val="0"/>
           <w:i/>
-          <w:color w:val="555555"/>
           <w:sz w:val="22"/>
         </w:rPr>
-        <w:t>&gt; ipconfig. Se 169.254: ninguém deu endereço — reinicia o roteador, confere se o cabo está numa porta LAN (não na WAN). Se IP normal: ping no gateway e segue o diagnóstico.</w:t>
-      </w:r>
-    </w:p>
-    <w:p>
-      <w:pPr>
-        <w:spacing w:after="80"/>
-      </w:pPr>
-      <w:r>
-        <w:rPr>
-          <w:b/>
-          <w:i w:val="0"/>
-          <w:sz w:val="22"/>
-        </w:rPr>
-        <w:t>"Faltou luz ontem e agora a impressora sumiu do computador."</w:t>
-      </w:r>
-    </w:p>
-    <w:p>
-      <w:pPr>
-        <w:spacing w:after="80"/>
-      </w:pPr>
-      <w:r>
-        <w:rPr>
-          <w:b w:val="0"/>
-          <w:i/>
-          <w:color w:val="555555"/>
-          <w:sz w:val="22"/>
-        </w:rPr>
-        <w:t>&gt; O roteador reiniciou e a impressora ganhou outro IP; o computador procura no endereço antigo. Achar o IP novo no painel (pelo MAC). Solução definitiva: reserva de IP (Noite 9).</w:t>
-      </w:r>
-    </w:p>
-    <w:p>
-      <w:pPr>
-        <w:spacing w:after="80"/>
-      </w:pPr>
-      <w:r>
-        <w:rPr>
-          <w:b/>
-          <w:i w:val="0"/>
-          <w:sz w:val="22"/>
-        </w:rPr>
-        <w:t>"Acho que o vizinho está usando meu Wi-Fi. A internet anda lenta à noite."</w:t>
-      </w:r>
-    </w:p>
-    <w:p>
-      <w:pPr>
-        <w:spacing w:after="80"/>
-      </w:pPr>
-      <w:r>
-        <w:rPr>
-          <w:b w:val="0"/>
-          <w:i/>
-          <w:color w:val="555555"/>
-          <w:sz w:val="22"/>
-        </w:rPr>
-        <w:t>&gt; Painel do roteador → lista de aparelhos. Contar os aparelhos da casa com o cliente, identificar cada um. Sobrou? Trocar a senha do Wi-Fi (Noite 11).</w:t>
+        <w:t>&gt; "Pelo IP de fora dá pra saber o provedor e, mais ou menos, a cidade. A rua e a casa, só o provedor sabe — e só entrega com ordem da Justiça."</w:t>
       </w:r>
     </w:p>
     <w:p>
@@ -2741,318 +3521,22 @@
         <w:rPr>
           <w:b w:val="0"/>
           <w:i/>
-          <w:color w:val="555555"/>
           <w:sz w:val="22"/>
         </w:rPr>
-        <w:t>&gt; O que aparece no jogo é o IP de fora (do condomínio), não o da casa. Muda quando o roteador reinicia na maioria dos provedores. Calma, não é senha.</w:t>
+        <w:t>&gt; "O que aparece no jogo é o IP de fora (o da rua), não o da casa. Na maioria dos provedores ele muda quando o roteador reinicia. Não é senha."</w:t>
       </w:r>
     </w:p>
     <w:p>
       <w:pPr>
-        <w:pBdr>
-          <w:bottom w:val="single" w:sz="6" w:space="1" w:color="888888"/>
-        </w:pBdr>
-      </w:pPr>
-    </w:p>
-    <w:p>
-      <w:pPr>
-        <w:spacing w:before="280" w:after="120"/>
+        <w:spacing w:after="80"/>
       </w:pPr>
       <w:r>
         <w:rPr>
           <w:b/>
-          <w:color w:val="0B5C5C"/>
-          <w:sz w:val="30"/>
-        </w:rPr>
-        <w:t>BLOCO 9 — DUELO RELÂMPAGO · 15 MIN</w:t>
-      </w:r>
-    </w:p>
-    <w:p>
-      <w:pPr>
-        <w:spacing w:after="80"/>
-      </w:pPr>
-      <w:r>
-        <w:rPr>
-          <w:b w:val="0"/>
           <w:i w:val="0"/>
           <w:sz w:val="22"/>
         </w:rPr>
-        <w:t>Turma em dois times. Resposta em 5 segundos. Alterna.</w:t>
-      </w:r>
-    </w:p>
-    <w:p>
-      <w:pPr>
-        <w:spacing w:before="200" w:after="120"/>
-      </w:pPr>
-      <w:r>
-        <w:rPr>
-          <w:b/>
-          <w:color w:val="0B5C5C"/>
-          <w:sz w:val="24"/>
-        </w:rPr>
-        <w:t>14 perguntas de reserva</w:t>
-      </w:r>
-    </w:p>
-    <w:p>
-      <w:pPr>
-        <w:pStyle w:val="ListBullet"/>
-        <w:spacing w:after="40"/>
-      </w:pPr>
-      <w:r>
-        <w:rPr>
-          <w:sz w:val="22"/>
-        </w:rPr>
-        <w:t>Qual dos dois vem de fábrica: IP ou MAC? — MAC</w:t>
-      </w:r>
-    </w:p>
-    <w:p>
-      <w:pPr>
-        <w:pStyle w:val="ListBullet"/>
-        <w:spacing w:after="40"/>
-      </w:pPr>
-      <w:r>
-        <w:rPr>
-          <w:sz w:val="22"/>
-        </w:rPr>
-        <w:t>Quem dá o IP pro celular em casa? — O roteador (DHCP)</w:t>
-      </w:r>
-    </w:p>
-    <w:p>
-      <w:pPr>
-        <w:pStyle w:val="ListBullet"/>
-        <w:spacing w:after="40"/>
-      </w:pPr>
-      <w:r>
-        <w:rPr>
-          <w:sz w:val="22"/>
-        </w:rPr>
-        <w:t>Na analogia, o MAC é o quê? — O CPF</w:t>
-      </w:r>
-    </w:p>
-    <w:p>
-      <w:pPr>
-        <w:pStyle w:val="ListBullet"/>
-        <w:spacing w:after="40"/>
-      </w:pPr>
-      <w:r>
-        <w:rPr>
-          <w:sz w:val="22"/>
-        </w:rPr>
-        <w:t>E o IP? — O número do apartamento</w:t>
-      </w:r>
-    </w:p>
-    <w:p>
-      <w:pPr>
-        <w:pStyle w:val="ListBullet"/>
-        <w:spacing w:after="40"/>
-      </w:pPr>
-      <w:r>
-        <w:rPr>
-          <w:sz w:val="22"/>
-        </w:rPr>
-        <w:t>E o gateway? — A portaria (o roteador)</w:t>
-      </w:r>
-    </w:p>
-    <w:p>
-      <w:pPr>
-        <w:pStyle w:val="ListBullet"/>
-        <w:spacing w:after="40"/>
-      </w:pPr>
-      <w:r>
-        <w:rPr>
-          <w:sz w:val="22"/>
-        </w:rPr>
-        <w:t>192.168.0.10 e 192.168.0.200 estão na mesma rede? — Sim (mesmos três primeiros)</w:t>
-      </w:r>
-    </w:p>
-    <w:p>
-      <w:pPr>
-        <w:pStyle w:val="ListBullet"/>
-        <w:spacing w:after="40"/>
-      </w:pPr>
-      <w:r>
-        <w:rPr>
-          <w:sz w:val="22"/>
-        </w:rPr>
-        <w:t>192.168.0.10 e 192.168.1.10? — Não, na maioria das casas</w:t>
-      </w:r>
-    </w:p>
-    <w:p>
-      <w:pPr>
-        <w:pStyle w:val="ListBullet"/>
-        <w:spacing w:after="40"/>
-      </w:pPr>
-      <w:r>
-        <w:rPr>
-          <w:sz w:val="22"/>
-        </w:rPr>
-        <w:t>Computador com 169.254 quer dizer o quê? — Ninguém deu endereço pra ele</w:t>
-      </w:r>
-    </w:p>
-    <w:p>
-      <w:pPr>
-        <w:pStyle w:val="ListBullet"/>
-        <w:spacing w:after="40"/>
-      </w:pPr>
-      <w:r>
-        <w:rPr>
-          <w:sz w:val="22"/>
-        </w:rPr>
-        <w:t>"Mídia desconectada" no ipconfig. Problema de quê? — Físico: cabo ou porta</w:t>
-      </w:r>
-    </w:p>
-    <w:p>
-      <w:pPr>
-        <w:pStyle w:val="ListBullet"/>
-        <w:spacing w:after="40"/>
-      </w:pPr>
-      <w:r>
-        <w:rPr>
-          <w:sz w:val="22"/>
-        </w:rPr>
-        <w:t>Dois aparelhos na mesma casa podem ter o mesmo IP? — Não (dá conflito)</w:t>
-      </w:r>
-    </w:p>
-    <w:p>
-      <w:pPr>
-        <w:pStyle w:val="ListBullet"/>
-        <w:spacing w:after="40"/>
-      </w:pPr>
-      <w:r>
-        <w:rPr>
-          <w:sz w:val="22"/>
-        </w:rPr>
-        <w:t>E em casas diferentes? — Pode</w:t>
-      </w:r>
-    </w:p>
-    <w:p>
-      <w:pPr>
-        <w:pStyle w:val="ListBullet"/>
-        <w:spacing w:after="40"/>
-      </w:pPr>
-      <w:r>
-        <w:rPr>
-          <w:sz w:val="22"/>
-        </w:rPr>
-        <w:t>Pra que serve o ping? — Saber se um aparelho responde</w:t>
-      </w:r>
-    </w:p>
-    <w:p>
-      <w:pPr>
-        <w:pStyle w:val="ListBullet"/>
-        <w:spacing w:after="40"/>
-      </w:pPr>
-      <w:r>
-        <w:rPr>
-          <w:sz w:val="22"/>
-        </w:rPr>
-        <w:t>Por que o celular usa MAC aleatório? — Privacidade, pra não ser rastreado</w:t>
-      </w:r>
-    </w:p>
-    <w:p>
-      <w:pPr>
-        <w:pStyle w:val="ListBullet"/>
-        <w:spacing w:after="40"/>
-      </w:pPr>
-      <w:r>
-        <w:rPr>
-          <w:sz w:val="22"/>
-        </w:rPr>
-        <w:t>Onde o técnico vê quem está no Wi-Fi do cliente? — No painel do roteador</w:t>
-      </w:r>
-    </w:p>
-    <w:p>
-      <w:pPr>
-        <w:pBdr>
-          <w:bottom w:val="single" w:sz="6" w:space="1" w:color="888888"/>
-        </w:pBdr>
-      </w:pPr>
-    </w:p>
-    <w:p>
-      <w:pPr>
-        <w:spacing w:before="280" w:after="120"/>
-      </w:pPr>
-      <w:r>
-        <w:rPr>
-          <w:b/>
-          <w:color w:val="0B5C5C"/>
-          <w:sz w:val="30"/>
-        </w:rPr>
-        <w:t>BLOCO 10 — FECHAMENTO E TAREFA · 15 MIN</w:t>
-      </w:r>
-    </w:p>
-    <w:p>
-      <w:pPr>
-        <w:spacing w:before="200" w:after="120"/>
-      </w:pPr>
-      <w:r>
-        <w:rPr>
-          <w:b/>
-          <w:color w:val="0B5C5C"/>
-          <w:sz w:val="24"/>
-        </w:rPr>
-        <w:t>Quiz de saída</w:t>
-      </w:r>
-    </w:p>
-    <w:p>
-      <w:pPr>
-        <w:pStyle w:val="ListBullet"/>
-        <w:spacing w:after="40"/>
-      </w:pPr>
-      <w:r>
-        <w:rPr>
-          <w:sz w:val="22"/>
-        </w:rPr>
-        <w:t>Diferença entre IP e MAC, numa frase cada</w:t>
-      </w:r>
-    </w:p>
-    <w:p>
-      <w:pPr>
-        <w:pStyle w:val="ListBullet"/>
-        <w:spacing w:after="40"/>
-      </w:pPr>
-      <w:r>
-        <w:rPr>
-          <w:sz w:val="22"/>
-        </w:rPr>
-        <w:t>O que é o gateway e qual o número dele na rede de hoje?</w:t>
-      </w:r>
-    </w:p>
-    <w:p>
-      <w:pPr>
-        <w:pStyle w:val="ListBullet"/>
-        <w:spacing w:after="40"/>
-      </w:pPr>
-      <w:r>
-        <w:rPr>
-          <w:sz w:val="22"/>
-        </w:rPr>
-        <w:t>O que o 169.254 conta pro técnico?</w:t>
-      </w:r>
-    </w:p>
-    <w:p>
-      <w:pPr>
-        <w:pStyle w:val="ListBullet"/>
-        <w:spacing w:after="40"/>
-      </w:pPr>
-      <w:r>
-        <w:rPr>
-          <w:sz w:val="22"/>
-        </w:rPr>
-        <w:t>Como você descobre se tem aparelho estranho no Wi-Fi do cliente?</w:t>
-      </w:r>
-    </w:p>
-    <w:p>
-      <w:pPr>
-        <w:spacing w:before="200" w:after="120"/>
-      </w:pPr>
-      <w:r>
-        <w:rPr>
-          <w:b/>
-          <w:color w:val="0B5C5C"/>
-          <w:sz w:val="24"/>
-        </w:rPr>
-        <w:t>A tarefa</w:t>
+        <w:t>"Por que a impressora some do computador depois que falta luz?"</w:t>
       </w:r>
     </w:p>
     <w:p>
@@ -3065,79 +3549,7 @@
           <w:i/>
           <w:sz w:val="22"/>
         </w:rPr>
-        <w:t>"Hoje a gente digitou 192.168.0.1 no navegador. Mas ninguém digita 142.250.… pra entrar no Google — digita google.com.br. Quem transforma o nome em número? Isso é a Noite 7. A tarefa: no celular, abra três sites que você usa e anote o endereço completo que aparece na barra lá em cima — com o https:// e tudo. Repare se aparece um cadeado."</w:t>
-      </w:r>
-    </w:p>
-    <w:p>
-      <w:pPr>
-        <w:spacing w:before="200" w:after="120"/>
-      </w:pPr>
-      <w:r>
-        <w:rPr>
-          <w:b/>
-          <w:color w:val="0B5C5C"/>
-          <w:sz w:val="24"/>
-        </w:rPr>
-        <w:t>Anuncie a próxima</w:t>
-      </w:r>
-    </w:p>
-    <w:p>
-      <w:pPr>
-        <w:spacing w:after="80"/>
-      </w:pPr>
-      <w:r>
-        <w:rPr>
-          <w:b w:val="0"/>
-          <w:i/>
-          <w:sz w:val="22"/>
-        </w:rPr>
-        <w:t>"Na próxima noite: nomes na rede. Por que às vezes o WhatsApp funciona e o site não abre, o que é aquele cadeado do navegador e como reconhecer um site falso pelo endereço."</w:t>
-      </w:r>
-    </w:p>
-    <w:p>
-      <w:pPr>
-        <w:pBdr>
-          <w:bottom w:val="single" w:sz="6" w:space="1" w:color="888888"/>
-        </w:pBdr>
-      </w:pPr>
-    </w:p>
-    <w:p>
-      <w:pPr>
-        <w:spacing w:before="280" w:after="120"/>
-      </w:pPr>
-      <w:r>
-        <w:rPr>
-          <w:b/>
-          <w:color w:val="0B5C5C"/>
-          <w:sz w:val="30"/>
-        </w:rPr>
-        <w:t>SE PERGUNTAREM</w:t>
-      </w:r>
-    </w:p>
-    <w:p>
-      <w:pPr>
-        <w:spacing w:after="80"/>
-      </w:pPr>
-      <w:r>
-        <w:rPr>
-          <w:b/>
-          <w:i w:val="0"/>
-          <w:sz w:val="22"/>
-        </w:rPr>
-        <w:t>"Dá pra descobrir onde a pessoa mora pelo IP?"</w:t>
-      </w:r>
-    </w:p>
-    <w:p>
-      <w:pPr>
-        <w:spacing w:after="80"/>
-      </w:pPr>
-      <w:r>
-        <w:rPr>
-          <w:b w:val="0"/>
-          <w:i/>
-          <w:sz w:val="22"/>
-        </w:rPr>
-        <w:t>&gt; "Pelo IP de fora dá pra saber o provedor e, mais ou menos, a cidade. A rua e a casa, só o provedor sabe — e só entrega com ordem da Justiça."</w:t>
+        <w:t>&gt; "O roteador reinicia e a impressora pode ganhar outro apartamento; o computador continua procurando no número antigo. A solução é reservar o IP dela no roteador — Noite 9."</w:t>
       </w:r>
     </w:p>
     <w:p>
@@ -3354,7 +3766,7 @@
           <w:i w:val="0"/>
           <w:sz w:val="22"/>
         </w:rPr>
-        <w:t>Desenvolvi atividade sobre endereçamento em redes locais. Apresentei o endereço físico (MAC) e o endereço lógico (IPv4) por meio de analogia com um condomínio, relacionando gateway padrão, atribuição automática de endereços pelo serviço DHCP do roteador e a diferença entre endereço privado (rede interna) e endereço público atribuído pelo provedor, incluindo o uso de MAC aleatório pelos dispositivos móveis. Os estudantes identificaram os endereços IP e MAC de celulares e computadores (ipconfig), acessaram a interface de administração dos roteadores da bancada em equipes e identificaram os dispositivos conectados pela lista de clientes, incluindo a localização de um dispositivo não autorizado. Realizaram testes de conectividade com o comando ping e diagnosticaram uma falha de atribuição de endereço (endereço de configuração automática 169.254) em roteador com DHCP desativado, aplicando os conceitos em simulações de atendimento ao cliente.</w:t>
+        <w:t>Desenvolvi atividade sobre endereçamento em redes locais. Apresentei o endereço físico (MAC) e o endereço lógico (IPv4) por meio de analogia com um condomínio, relacionando gateway padrão, atribuição automática de endereços pelo serviço DHCP do roteador e a diferença entre endereço privado (rede interna) e endereço público atribuído pelo provedor, incluindo o uso de MAC aleatório pelos dispositivos móveis. Os estudantes encenaram o funcionamento do DHCP (atribuição, renovação, esgotamento de endereços, ausência do servidor e conflito de IP), identificaram os endereços IP e MAC de celulares e computadores (ipconfig), acessaram a interface de administração dos roteadores da bancada em equipes e identificaram os dispositivos conectados pela lista de clientes, incluindo a localização de um dispositivo não autorizado. Realizaram testes de conectividade com o comando ping e diagnosticaram uma falha de atribuição de endereço (endereço de configuração automática 169.254) em roteador com DHCP desativado. Ao final, cada equipe produziu e apresentou um diagrama da rede analisada.</w:t>
       </w:r>
     </w:p>
     <w:p>
@@ -3427,7 +3839,7 @@
           <w:i w:val="0"/>
           <w:sz w:val="22"/>
         </w:rPr>
-        <w:t>2. O porteiro vivo</w:t>
+        <w:t>2. Conflito de IP de verdade</w:t>
       </w:r>
     </w:p>
     <w:p>
@@ -3440,7 +3852,7 @@
           <w:i w:val="0"/>
           <w:sz w:val="22"/>
         </w:rPr>
-        <w:t>Encenação: um aluno é o roteador com uma folha de "apartamentos" (192.168.0.100 a .110). Os outros chegam um por um dizendo seu "MAC" (o nome). O roteador anota e entrega um número. Depois um sai e volta: recebe o mesmo número? Um chega sem o porteiro estar lá: fica com 169.254. 15 min.</w:t>
+        <w:t>No computador, configure na mão (Propriedades do IPv4) o MESMO IP que o celular de um aluno recebeu. O Windows avisa o conflito e um dos dois para de funcionar. Volte pra "Obter endereço automaticamente". É a rodada 7 do porteiro, ao vivo. 15 min.</w:t>
       </w:r>
     </w:p>
     <w:p>
@@ -3505,7 +3917,7 @@
           <w:i w:val="0"/>
           <w:sz w:val="22"/>
         </w:rPr>
-        <w:t>5. Mapa da turma</w:t>
+        <w:t>5. Etiqueta × painel</w:t>
       </w:r>
     </w:p>
     <w:p>
@@ -3518,9 +3930,1516 @@
           <w:i w:val="0"/>
           <w:sz w:val="22"/>
         </w:rPr>
-        <w:t>Cada equipe desenha no papel o "condomínio" da sua rede: o roteador no meio com o gateway, e cada aparelho com IP, MAC e dono. Cola na parede. Na Noite 8 esse desenho vira o ponto de partida da planta de instalação. 15 min.</w:t>
+        <w:t>No painel, na tela de Status, o roteador mostra o MAC da LAN e o da WAN (Internet). Compare com a etiqueta: costumam diferir só no último par. Mostra que o roteador tem uma placa de rede pra cada lado — a da rua e a do condomínio. 10 min.</w:t>
       </w:r>
     </w:p>
+    <w:p>
+      <w:r>
+        <w:br w:type="page"/>
+      </w:r>
+    </w:p>
+    <w:p>
+      <w:pPr>
+        <w:spacing w:before="280" w:after="120"/>
+      </w:pPr>
+      <w:r>
+        <w:rPr>
+          <w:b/>
+          <w:color w:val="0B5C5C"/>
+          <w:sz w:val="30"/>
+        </w:rPr>
+        <w:t>ANEXO — LIVRO DA PORTARIA (IMPRIMIR 1)</w:t>
+      </w:r>
+    </w:p>
+    <w:p>
+      <w:pPr>
+        <w:spacing w:after="80"/>
+      </w:pPr>
+      <w:r>
+        <w:rPr>
+          <w:b w:val="0"/>
+          <w:i/>
+          <w:color w:val="555555"/>
+          <w:sz w:val="20"/>
+        </w:rPr>
+        <w:t>Portaria (gateway): 192.168.0.1   ·   Risque as linhas que sobrarem: 2 apartamentos a menos que o número de alunos.</w:t>
+      </w:r>
+    </w:p>
+    <w:tbl>
+      <w:tblPr>
+        <w:tblStyle w:val="LightGrid-Accent1"/>
+        <w:tblW w:type="auto" w:w="0"/>
+        <w:tblLook w:firstColumn="1" w:firstRow="1" w:lastColumn="0" w:lastRow="0" w:noHBand="0" w:noVBand="1" w:val="04A0"/>
+      </w:tblPr>
+      <w:tblGrid>
+        <w:gridCol w:w="3324"/>
+        <w:gridCol w:w="3324"/>
+        <w:gridCol w:w="3324"/>
+      </w:tblGrid>
+      <w:tr>
+        <w:tc>
+          <w:tcPr>
+            <w:tcW w:type="dxa" w:w="2551"/>
+            <w:shd w:val="clear" w:color="auto" w:fill="0B5C5C"/>
+          </w:tcPr>
+          <w:p>
+            <w:r/>
+            <w:r>
+              <w:rPr>
+                <w:b/>
+                <w:color w:val="FFFFFF"/>
+                <w:sz w:val="20"/>
+              </w:rPr>
+              <w:t>Apartamento (IP)</w:t>
+            </w:r>
+          </w:p>
+        </w:tc>
+        <w:tc>
+          <w:tcPr>
+            <w:tcW w:type="dxa" w:w="5102"/>
+            <w:shd w:val="clear" w:color="auto" w:fill="0B5C5C"/>
+          </w:tcPr>
+          <w:p>
+            <w:r/>
+            <w:r>
+              <w:rPr>
+                <w:b/>
+                <w:color w:val="FFFFFF"/>
+                <w:sz w:val="20"/>
+              </w:rPr>
+              <w:t>MAC de quem recebeu</w:t>
+            </w:r>
+          </w:p>
+        </w:tc>
+        <w:tc>
+          <w:tcPr>
+            <w:tcW w:type="dxa" w:w="1701"/>
+            <w:shd w:val="clear" w:color="auto" w:fill="0B5C5C"/>
+          </w:tcPr>
+          <w:p>
+            <w:r/>
+            <w:r>
+              <w:rPr>
+                <w:b/>
+                <w:color w:val="FFFFFF"/>
+                <w:sz w:val="20"/>
+              </w:rPr>
+              <w:t>Rodada</w:t>
+            </w:r>
+          </w:p>
+        </w:tc>
+      </w:tr>
+      <w:tr>
+        <w:trPr>
+          <w:trHeight w:val="539"/>
+        </w:trPr>
+        <w:tc>
+          <w:tcPr>
+            <w:tcW w:type="dxa" w:w="2551"/>
+          </w:tcPr>
+          <w:p>
+            <w:r/>
+            <w:r>
+              <w:rPr>
+                <w:sz w:val="20"/>
+              </w:rPr>
+              <w:t>192.168.0.100</w:t>
+            </w:r>
+          </w:p>
+        </w:tc>
+        <w:tc>
+          <w:tcPr>
+            <w:tcW w:type="dxa" w:w="5102"/>
+          </w:tcPr>
+          <w:p>
+            <w:r/>
+            <w:r>
+              <w:rPr>
+                <w:sz w:val="20"/>
+              </w:rPr>
+            </w:r>
+          </w:p>
+        </w:tc>
+        <w:tc>
+          <w:tcPr>
+            <w:tcW w:type="dxa" w:w="1701"/>
+          </w:tcPr>
+          <w:p>
+            <w:r/>
+            <w:r>
+              <w:rPr>
+                <w:sz w:val="20"/>
+              </w:rPr>
+            </w:r>
+          </w:p>
+        </w:tc>
+      </w:tr>
+      <w:tr>
+        <w:trPr>
+          <w:trHeight w:val="539"/>
+        </w:trPr>
+        <w:tc>
+          <w:tcPr>
+            <w:tcW w:type="dxa" w:w="2551"/>
+          </w:tcPr>
+          <w:p>
+            <w:r/>
+            <w:r>
+              <w:rPr>
+                <w:sz w:val="20"/>
+              </w:rPr>
+              <w:t>192.168.0.101</w:t>
+            </w:r>
+          </w:p>
+        </w:tc>
+        <w:tc>
+          <w:tcPr>
+            <w:tcW w:type="dxa" w:w="5102"/>
+          </w:tcPr>
+          <w:p>
+            <w:r/>
+            <w:r>
+              <w:rPr>
+                <w:sz w:val="20"/>
+              </w:rPr>
+            </w:r>
+          </w:p>
+        </w:tc>
+        <w:tc>
+          <w:tcPr>
+            <w:tcW w:type="dxa" w:w="1701"/>
+          </w:tcPr>
+          <w:p>
+            <w:r/>
+            <w:r>
+              <w:rPr>
+                <w:sz w:val="20"/>
+              </w:rPr>
+            </w:r>
+          </w:p>
+        </w:tc>
+      </w:tr>
+      <w:tr>
+        <w:trPr>
+          <w:trHeight w:val="539"/>
+        </w:trPr>
+        <w:tc>
+          <w:tcPr>
+            <w:tcW w:type="dxa" w:w="2551"/>
+          </w:tcPr>
+          <w:p>
+            <w:r/>
+            <w:r>
+              <w:rPr>
+                <w:sz w:val="20"/>
+              </w:rPr>
+              <w:t>192.168.0.102</w:t>
+            </w:r>
+          </w:p>
+        </w:tc>
+        <w:tc>
+          <w:tcPr>
+            <w:tcW w:type="dxa" w:w="5102"/>
+          </w:tcPr>
+          <w:p>
+            <w:r/>
+            <w:r>
+              <w:rPr>
+                <w:sz w:val="20"/>
+              </w:rPr>
+            </w:r>
+          </w:p>
+        </w:tc>
+        <w:tc>
+          <w:tcPr>
+            <w:tcW w:type="dxa" w:w="1701"/>
+          </w:tcPr>
+          <w:p>
+            <w:r/>
+            <w:r>
+              <w:rPr>
+                <w:sz w:val="20"/>
+              </w:rPr>
+            </w:r>
+          </w:p>
+        </w:tc>
+      </w:tr>
+      <w:tr>
+        <w:trPr>
+          <w:trHeight w:val="539"/>
+        </w:trPr>
+        <w:tc>
+          <w:tcPr>
+            <w:tcW w:type="dxa" w:w="2551"/>
+          </w:tcPr>
+          <w:p>
+            <w:r/>
+            <w:r>
+              <w:rPr>
+                <w:sz w:val="20"/>
+              </w:rPr>
+              <w:t>192.168.0.103</w:t>
+            </w:r>
+          </w:p>
+        </w:tc>
+        <w:tc>
+          <w:tcPr>
+            <w:tcW w:type="dxa" w:w="5102"/>
+          </w:tcPr>
+          <w:p>
+            <w:r/>
+            <w:r>
+              <w:rPr>
+                <w:sz w:val="20"/>
+              </w:rPr>
+            </w:r>
+          </w:p>
+        </w:tc>
+        <w:tc>
+          <w:tcPr>
+            <w:tcW w:type="dxa" w:w="1701"/>
+          </w:tcPr>
+          <w:p>
+            <w:r/>
+            <w:r>
+              <w:rPr>
+                <w:sz w:val="20"/>
+              </w:rPr>
+            </w:r>
+          </w:p>
+        </w:tc>
+      </w:tr>
+      <w:tr>
+        <w:trPr>
+          <w:trHeight w:val="539"/>
+        </w:trPr>
+        <w:tc>
+          <w:tcPr>
+            <w:tcW w:type="dxa" w:w="2551"/>
+          </w:tcPr>
+          <w:p>
+            <w:r/>
+            <w:r>
+              <w:rPr>
+                <w:sz w:val="20"/>
+              </w:rPr>
+              <w:t>192.168.0.104</w:t>
+            </w:r>
+          </w:p>
+        </w:tc>
+        <w:tc>
+          <w:tcPr>
+            <w:tcW w:type="dxa" w:w="5102"/>
+          </w:tcPr>
+          <w:p>
+            <w:r/>
+            <w:r>
+              <w:rPr>
+                <w:sz w:val="20"/>
+              </w:rPr>
+            </w:r>
+          </w:p>
+        </w:tc>
+        <w:tc>
+          <w:tcPr>
+            <w:tcW w:type="dxa" w:w="1701"/>
+          </w:tcPr>
+          <w:p>
+            <w:r/>
+            <w:r>
+              <w:rPr>
+                <w:sz w:val="20"/>
+              </w:rPr>
+            </w:r>
+          </w:p>
+        </w:tc>
+      </w:tr>
+      <w:tr>
+        <w:trPr>
+          <w:trHeight w:val="539"/>
+        </w:trPr>
+        <w:tc>
+          <w:tcPr>
+            <w:tcW w:type="dxa" w:w="2551"/>
+          </w:tcPr>
+          <w:p>
+            <w:r/>
+            <w:r>
+              <w:rPr>
+                <w:sz w:val="20"/>
+              </w:rPr>
+              <w:t>192.168.0.105</w:t>
+            </w:r>
+          </w:p>
+        </w:tc>
+        <w:tc>
+          <w:tcPr>
+            <w:tcW w:type="dxa" w:w="5102"/>
+          </w:tcPr>
+          <w:p>
+            <w:r/>
+            <w:r>
+              <w:rPr>
+                <w:sz w:val="20"/>
+              </w:rPr>
+            </w:r>
+          </w:p>
+        </w:tc>
+        <w:tc>
+          <w:tcPr>
+            <w:tcW w:type="dxa" w:w="1701"/>
+          </w:tcPr>
+          <w:p>
+            <w:r/>
+            <w:r>
+              <w:rPr>
+                <w:sz w:val="20"/>
+              </w:rPr>
+            </w:r>
+          </w:p>
+        </w:tc>
+      </w:tr>
+      <w:tr>
+        <w:trPr>
+          <w:trHeight w:val="539"/>
+        </w:trPr>
+        <w:tc>
+          <w:tcPr>
+            <w:tcW w:type="dxa" w:w="2551"/>
+          </w:tcPr>
+          <w:p>
+            <w:r/>
+            <w:r>
+              <w:rPr>
+                <w:sz w:val="20"/>
+              </w:rPr>
+              <w:t>192.168.0.106</w:t>
+            </w:r>
+          </w:p>
+        </w:tc>
+        <w:tc>
+          <w:tcPr>
+            <w:tcW w:type="dxa" w:w="5102"/>
+          </w:tcPr>
+          <w:p>
+            <w:r/>
+            <w:r>
+              <w:rPr>
+                <w:sz w:val="20"/>
+              </w:rPr>
+            </w:r>
+          </w:p>
+        </w:tc>
+        <w:tc>
+          <w:tcPr>
+            <w:tcW w:type="dxa" w:w="1701"/>
+          </w:tcPr>
+          <w:p>
+            <w:r/>
+            <w:r>
+              <w:rPr>
+                <w:sz w:val="20"/>
+              </w:rPr>
+            </w:r>
+          </w:p>
+        </w:tc>
+      </w:tr>
+      <w:tr>
+        <w:trPr>
+          <w:trHeight w:val="539"/>
+        </w:trPr>
+        <w:tc>
+          <w:tcPr>
+            <w:tcW w:type="dxa" w:w="2551"/>
+          </w:tcPr>
+          <w:p>
+            <w:r/>
+            <w:r>
+              <w:rPr>
+                <w:sz w:val="20"/>
+              </w:rPr>
+              <w:t>192.168.0.107</w:t>
+            </w:r>
+          </w:p>
+        </w:tc>
+        <w:tc>
+          <w:tcPr>
+            <w:tcW w:type="dxa" w:w="5102"/>
+          </w:tcPr>
+          <w:p>
+            <w:r/>
+            <w:r>
+              <w:rPr>
+                <w:sz w:val="20"/>
+              </w:rPr>
+            </w:r>
+          </w:p>
+        </w:tc>
+        <w:tc>
+          <w:tcPr>
+            <w:tcW w:type="dxa" w:w="1701"/>
+          </w:tcPr>
+          <w:p>
+            <w:r/>
+            <w:r>
+              <w:rPr>
+                <w:sz w:val="20"/>
+              </w:rPr>
+            </w:r>
+          </w:p>
+        </w:tc>
+      </w:tr>
+      <w:tr>
+        <w:trPr>
+          <w:trHeight w:val="539"/>
+        </w:trPr>
+        <w:tc>
+          <w:tcPr>
+            <w:tcW w:type="dxa" w:w="2551"/>
+          </w:tcPr>
+          <w:p>
+            <w:r/>
+            <w:r>
+              <w:rPr>
+                <w:sz w:val="20"/>
+              </w:rPr>
+              <w:t>192.168.0.108</w:t>
+            </w:r>
+          </w:p>
+        </w:tc>
+        <w:tc>
+          <w:tcPr>
+            <w:tcW w:type="dxa" w:w="5102"/>
+          </w:tcPr>
+          <w:p>
+            <w:r/>
+            <w:r>
+              <w:rPr>
+                <w:sz w:val="20"/>
+              </w:rPr>
+            </w:r>
+          </w:p>
+        </w:tc>
+        <w:tc>
+          <w:tcPr>
+            <w:tcW w:type="dxa" w:w="1701"/>
+          </w:tcPr>
+          <w:p>
+            <w:r/>
+            <w:r>
+              <w:rPr>
+                <w:sz w:val="20"/>
+              </w:rPr>
+            </w:r>
+          </w:p>
+        </w:tc>
+      </w:tr>
+      <w:tr>
+        <w:trPr>
+          <w:trHeight w:val="539"/>
+        </w:trPr>
+        <w:tc>
+          <w:tcPr>
+            <w:tcW w:type="dxa" w:w="2551"/>
+          </w:tcPr>
+          <w:p>
+            <w:r/>
+            <w:r>
+              <w:rPr>
+                <w:sz w:val="20"/>
+              </w:rPr>
+              <w:t>192.168.0.109</w:t>
+            </w:r>
+          </w:p>
+        </w:tc>
+        <w:tc>
+          <w:tcPr>
+            <w:tcW w:type="dxa" w:w="5102"/>
+          </w:tcPr>
+          <w:p>
+            <w:r/>
+            <w:r>
+              <w:rPr>
+                <w:sz w:val="20"/>
+              </w:rPr>
+            </w:r>
+          </w:p>
+        </w:tc>
+        <w:tc>
+          <w:tcPr>
+            <w:tcW w:type="dxa" w:w="1701"/>
+          </w:tcPr>
+          <w:p>
+            <w:r/>
+            <w:r>
+              <w:rPr>
+                <w:sz w:val="20"/>
+              </w:rPr>
+            </w:r>
+          </w:p>
+        </w:tc>
+      </w:tr>
+      <w:tr>
+        <w:trPr>
+          <w:trHeight w:val="539"/>
+        </w:trPr>
+        <w:tc>
+          <w:tcPr>
+            <w:tcW w:type="dxa" w:w="2551"/>
+          </w:tcPr>
+          <w:p>
+            <w:r/>
+            <w:r>
+              <w:rPr>
+                <w:sz w:val="20"/>
+              </w:rPr>
+              <w:t>192.168.0.110</w:t>
+            </w:r>
+          </w:p>
+        </w:tc>
+        <w:tc>
+          <w:tcPr>
+            <w:tcW w:type="dxa" w:w="5102"/>
+          </w:tcPr>
+          <w:p>
+            <w:r/>
+            <w:r>
+              <w:rPr>
+                <w:sz w:val="20"/>
+              </w:rPr>
+            </w:r>
+          </w:p>
+        </w:tc>
+        <w:tc>
+          <w:tcPr>
+            <w:tcW w:type="dxa" w:w="1701"/>
+          </w:tcPr>
+          <w:p>
+            <w:r/>
+            <w:r>
+              <w:rPr>
+                <w:sz w:val="20"/>
+              </w:rPr>
+            </w:r>
+          </w:p>
+        </w:tc>
+      </w:tr>
+      <w:tr>
+        <w:trPr>
+          <w:trHeight w:val="539"/>
+        </w:trPr>
+        <w:tc>
+          <w:tcPr>
+            <w:tcW w:type="dxa" w:w="2551"/>
+          </w:tcPr>
+          <w:p>
+            <w:r/>
+            <w:r>
+              <w:rPr>
+                <w:sz w:val="20"/>
+              </w:rPr>
+              <w:t>192.168.0.111</w:t>
+            </w:r>
+          </w:p>
+        </w:tc>
+        <w:tc>
+          <w:tcPr>
+            <w:tcW w:type="dxa" w:w="5102"/>
+          </w:tcPr>
+          <w:p>
+            <w:r/>
+            <w:r>
+              <w:rPr>
+                <w:sz w:val="20"/>
+              </w:rPr>
+            </w:r>
+          </w:p>
+        </w:tc>
+        <w:tc>
+          <w:tcPr>
+            <w:tcW w:type="dxa" w:w="1701"/>
+          </w:tcPr>
+          <w:p>
+            <w:r/>
+            <w:r>
+              <w:rPr>
+                <w:sz w:val="20"/>
+              </w:rPr>
+            </w:r>
+          </w:p>
+        </w:tc>
+      </w:tr>
+      <w:tr>
+        <w:trPr>
+          <w:trHeight w:val="539"/>
+        </w:trPr>
+        <w:tc>
+          <w:tcPr>
+            <w:tcW w:type="dxa" w:w="2551"/>
+          </w:tcPr>
+          <w:p>
+            <w:r/>
+            <w:r>
+              <w:rPr>
+                <w:sz w:val="20"/>
+              </w:rPr>
+              <w:t>192.168.0.112</w:t>
+            </w:r>
+          </w:p>
+        </w:tc>
+        <w:tc>
+          <w:tcPr>
+            <w:tcW w:type="dxa" w:w="5102"/>
+          </w:tcPr>
+          <w:p>
+            <w:r/>
+            <w:r>
+              <w:rPr>
+                <w:sz w:val="20"/>
+              </w:rPr>
+            </w:r>
+          </w:p>
+        </w:tc>
+        <w:tc>
+          <w:tcPr>
+            <w:tcW w:type="dxa" w:w="1701"/>
+          </w:tcPr>
+          <w:p>
+            <w:r/>
+            <w:r>
+              <w:rPr>
+                <w:sz w:val="20"/>
+              </w:rPr>
+            </w:r>
+          </w:p>
+        </w:tc>
+      </w:tr>
+      <w:tr>
+        <w:trPr>
+          <w:trHeight w:val="539"/>
+        </w:trPr>
+        <w:tc>
+          <w:tcPr>
+            <w:tcW w:type="dxa" w:w="2551"/>
+          </w:tcPr>
+          <w:p>
+            <w:r/>
+            <w:r>
+              <w:rPr>
+                <w:sz w:val="20"/>
+              </w:rPr>
+              <w:t>192.168.0.113</w:t>
+            </w:r>
+          </w:p>
+        </w:tc>
+        <w:tc>
+          <w:tcPr>
+            <w:tcW w:type="dxa" w:w="5102"/>
+          </w:tcPr>
+          <w:p>
+            <w:r/>
+            <w:r>
+              <w:rPr>
+                <w:sz w:val="20"/>
+              </w:rPr>
+            </w:r>
+          </w:p>
+        </w:tc>
+        <w:tc>
+          <w:tcPr>
+            <w:tcW w:type="dxa" w:w="1701"/>
+          </w:tcPr>
+          <w:p>
+            <w:r/>
+            <w:r>
+              <w:rPr>
+                <w:sz w:val="20"/>
+              </w:rPr>
+            </w:r>
+          </w:p>
+        </w:tc>
+      </w:tr>
+      <w:tr>
+        <w:trPr>
+          <w:trHeight w:val="539"/>
+        </w:trPr>
+        <w:tc>
+          <w:tcPr>
+            <w:tcW w:type="dxa" w:w="2551"/>
+          </w:tcPr>
+          <w:p>
+            <w:r/>
+            <w:r>
+              <w:rPr>
+                <w:sz w:val="20"/>
+              </w:rPr>
+              <w:t>192.168.0.114</w:t>
+            </w:r>
+          </w:p>
+        </w:tc>
+        <w:tc>
+          <w:tcPr>
+            <w:tcW w:type="dxa" w:w="5102"/>
+          </w:tcPr>
+          <w:p>
+            <w:r/>
+            <w:r>
+              <w:rPr>
+                <w:sz w:val="20"/>
+              </w:rPr>
+            </w:r>
+          </w:p>
+        </w:tc>
+        <w:tc>
+          <w:tcPr>
+            <w:tcW w:type="dxa" w:w="1701"/>
+          </w:tcPr>
+          <w:p>
+            <w:r/>
+            <w:r>
+              <w:rPr>
+                <w:sz w:val="20"/>
+              </w:rPr>
+            </w:r>
+          </w:p>
+        </w:tc>
+      </w:tr>
+      <w:tr>
+        <w:trPr>
+          <w:trHeight w:val="539"/>
+        </w:trPr>
+        <w:tc>
+          <w:tcPr>
+            <w:tcW w:type="dxa" w:w="2551"/>
+          </w:tcPr>
+          <w:p>
+            <w:r/>
+            <w:r>
+              <w:rPr>
+                <w:sz w:val="20"/>
+              </w:rPr>
+              <w:t>192.168.0.115</w:t>
+            </w:r>
+          </w:p>
+        </w:tc>
+        <w:tc>
+          <w:tcPr>
+            <w:tcW w:type="dxa" w:w="5102"/>
+          </w:tcPr>
+          <w:p>
+            <w:r/>
+            <w:r>
+              <w:rPr>
+                <w:sz w:val="20"/>
+              </w:rPr>
+            </w:r>
+          </w:p>
+        </w:tc>
+        <w:tc>
+          <w:tcPr>
+            <w:tcW w:type="dxa" w:w="1701"/>
+          </w:tcPr>
+          <w:p>
+            <w:r/>
+            <w:r>
+              <w:rPr>
+                <w:sz w:val="20"/>
+              </w:rPr>
+            </w:r>
+          </w:p>
+        </w:tc>
+      </w:tr>
+      <w:tr>
+        <w:trPr>
+          <w:trHeight w:val="539"/>
+        </w:trPr>
+        <w:tc>
+          <w:tcPr>
+            <w:tcW w:type="dxa" w:w="2551"/>
+          </w:tcPr>
+          <w:p>
+            <w:r/>
+            <w:r>
+              <w:rPr>
+                <w:sz w:val="20"/>
+              </w:rPr>
+              <w:t>192.168.0.116</w:t>
+            </w:r>
+          </w:p>
+        </w:tc>
+        <w:tc>
+          <w:tcPr>
+            <w:tcW w:type="dxa" w:w="5102"/>
+          </w:tcPr>
+          <w:p>
+            <w:r/>
+            <w:r>
+              <w:rPr>
+                <w:sz w:val="20"/>
+              </w:rPr>
+            </w:r>
+          </w:p>
+        </w:tc>
+        <w:tc>
+          <w:tcPr>
+            <w:tcW w:type="dxa" w:w="1701"/>
+          </w:tcPr>
+          <w:p>
+            <w:r/>
+            <w:r>
+              <w:rPr>
+                <w:sz w:val="20"/>
+              </w:rPr>
+            </w:r>
+          </w:p>
+        </w:tc>
+      </w:tr>
+      <w:tr>
+        <w:trPr>
+          <w:trHeight w:val="539"/>
+        </w:trPr>
+        <w:tc>
+          <w:tcPr>
+            <w:tcW w:type="dxa" w:w="2551"/>
+          </w:tcPr>
+          <w:p>
+            <w:r/>
+            <w:r>
+              <w:rPr>
+                <w:sz w:val="20"/>
+              </w:rPr>
+              <w:t>192.168.0.117</w:t>
+            </w:r>
+          </w:p>
+        </w:tc>
+        <w:tc>
+          <w:tcPr>
+            <w:tcW w:type="dxa" w:w="5102"/>
+          </w:tcPr>
+          <w:p>
+            <w:r/>
+            <w:r>
+              <w:rPr>
+                <w:sz w:val="20"/>
+              </w:rPr>
+            </w:r>
+          </w:p>
+        </w:tc>
+        <w:tc>
+          <w:tcPr>
+            <w:tcW w:type="dxa" w:w="1701"/>
+          </w:tcPr>
+          <w:p>
+            <w:r/>
+            <w:r>
+              <w:rPr>
+                <w:sz w:val="20"/>
+              </w:rPr>
+            </w:r>
+          </w:p>
+        </w:tc>
+      </w:tr>
+      <w:tr>
+        <w:trPr>
+          <w:trHeight w:val="539"/>
+        </w:trPr>
+        <w:tc>
+          <w:tcPr>
+            <w:tcW w:type="dxa" w:w="2551"/>
+          </w:tcPr>
+          <w:p>
+            <w:r/>
+            <w:r>
+              <w:rPr>
+                <w:sz w:val="20"/>
+              </w:rPr>
+              <w:t>192.168.0.118</w:t>
+            </w:r>
+          </w:p>
+        </w:tc>
+        <w:tc>
+          <w:tcPr>
+            <w:tcW w:type="dxa" w:w="5102"/>
+          </w:tcPr>
+          <w:p>
+            <w:r/>
+            <w:r>
+              <w:rPr>
+                <w:sz w:val="20"/>
+              </w:rPr>
+            </w:r>
+          </w:p>
+        </w:tc>
+        <w:tc>
+          <w:tcPr>
+            <w:tcW w:type="dxa" w:w="1701"/>
+          </w:tcPr>
+          <w:p>
+            <w:r/>
+            <w:r>
+              <w:rPr>
+                <w:sz w:val="20"/>
+              </w:rPr>
+            </w:r>
+          </w:p>
+        </w:tc>
+      </w:tr>
+      <w:tr>
+        <w:trPr>
+          <w:trHeight w:val="539"/>
+        </w:trPr>
+        <w:tc>
+          <w:tcPr>
+            <w:tcW w:type="dxa" w:w="2551"/>
+          </w:tcPr>
+          <w:p>
+            <w:r/>
+            <w:r>
+              <w:rPr>
+                <w:sz w:val="20"/>
+              </w:rPr>
+              <w:t>192.168.0.119</w:t>
+            </w:r>
+          </w:p>
+        </w:tc>
+        <w:tc>
+          <w:tcPr>
+            <w:tcW w:type="dxa" w:w="5102"/>
+          </w:tcPr>
+          <w:p>
+            <w:r/>
+            <w:r>
+              <w:rPr>
+                <w:sz w:val="20"/>
+              </w:rPr>
+            </w:r>
+          </w:p>
+        </w:tc>
+        <w:tc>
+          <w:tcPr>
+            <w:tcW w:type="dxa" w:w="1701"/>
+          </w:tcPr>
+          <w:p>
+            <w:r/>
+            <w:r>
+              <w:rPr>
+                <w:sz w:val="20"/>
+              </w:rPr>
+            </w:r>
+          </w:p>
+        </w:tc>
+      </w:tr>
+    </w:tbl>
+    <w:p>
+      <w:r>
+        <w:br w:type="page"/>
+      </w:r>
+    </w:p>
+    <w:p>
+      <w:pPr>
+        <w:spacing w:before="280" w:after="120"/>
+      </w:pPr>
+      <w:r>
+        <w:rPr>
+          <w:b/>
+          <w:color w:val="0B5C5C"/>
+          <w:sz w:val="30"/>
+        </w:rPr>
+        <w:t>ANEXO — CARTÕES DE MAC (IMPRIMIR E RECORTAR)</w:t>
+      </w:r>
+    </w:p>
+    <w:p>
+      <w:pPr>
+        <w:spacing w:after="80"/>
+      </w:pPr>
+      <w:r>
+        <w:rPr>
+          <w:b w:val="0"/>
+          <w:i/>
+          <w:color w:val="555555"/>
+          <w:sz w:val="20"/>
+        </w:rPr>
+        <w:t>Um por aluno. Os cartões A e B são quase iguais de propósito: o porteiro precisa ler o MAC inteiro.</w:t>
+      </w:r>
+    </w:p>
+    <w:tbl>
+      <w:tblPr>
+        <w:tblStyle w:val="LightGrid-Accent1"/>
+        <w:tblW w:type="auto" w:w="0"/>
+        <w:tblLook w:firstColumn="1" w:firstRow="1" w:lastColumn="0" w:lastRow="0" w:noHBand="0" w:noVBand="1" w:val="04A0"/>
+      </w:tblPr>
+      <w:tblGrid>
+        <w:gridCol w:w="2493"/>
+        <w:gridCol w:w="2493"/>
+        <w:gridCol w:w="2493"/>
+        <w:gridCol w:w="2493"/>
+      </w:tblGrid>
+      <w:tr>
+        <w:trPr>
+          <w:trHeight w:val="1247"/>
+        </w:trPr>
+        <w:tc>
+          <w:tcPr>
+            <w:tcW w:type="dxa" w:w="2438"/>
+          </w:tcPr>
+          <w:p>
+            <w:r>
+              <w:rPr>
+                <w:b/>
+                <w:sz w:val="26"/>
+              </w:rPr>
+            </w:r>
+            <w:r>
+              <w:rPr>
+                <w:b/>
+                <w:sz w:val="26"/>
+              </w:rPr>
+              <w:t>A · MAC</w:t>
+              <w:br/>
+              <w:t>3C-52-82-1A-7F-09</w:t>
+            </w:r>
+          </w:p>
+        </w:tc>
+        <w:tc>
+          <w:tcPr>
+            <w:tcW w:type="dxa" w:w="2438"/>
+          </w:tcPr>
+          <w:p>
+            <w:r>
+              <w:rPr>
+                <w:b/>
+                <w:sz w:val="26"/>
+              </w:rPr>
+            </w:r>
+            <w:r>
+              <w:rPr>
+                <w:b/>
+                <w:sz w:val="26"/>
+              </w:rPr>
+              <w:t>B · MAC</w:t>
+              <w:br/>
+              <w:t>3C-52-82-1A-7F-90</w:t>
+            </w:r>
+          </w:p>
+        </w:tc>
+        <w:tc>
+          <w:tcPr>
+            <w:tcW w:type="dxa" w:w="2438"/>
+          </w:tcPr>
+          <w:p>
+            <w:r>
+              <w:rPr>
+                <w:b/>
+                <w:sz w:val="26"/>
+              </w:rPr>
+            </w:r>
+            <w:r>
+              <w:rPr>
+                <w:b/>
+                <w:sz w:val="26"/>
+              </w:rPr>
+              <w:t>3 · MAC</w:t>
+              <w:br/>
+              <w:t>60-32-B1-4D-22-E5</w:t>
+            </w:r>
+          </w:p>
+        </w:tc>
+        <w:tc>
+          <w:tcPr>
+            <w:tcW w:type="dxa" w:w="2438"/>
+          </w:tcPr>
+          <w:p>
+            <w:r>
+              <w:rPr>
+                <w:b/>
+                <w:sz w:val="26"/>
+              </w:rPr>
+            </w:r>
+            <w:r>
+              <w:rPr>
+                <w:b/>
+                <w:sz w:val="26"/>
+              </w:rPr>
+              <w:t>4 · MAC</w:t>
+              <w:br/>
+              <w:t>A4-C3-F0-11-8B-6D</w:t>
+            </w:r>
+          </w:p>
+        </w:tc>
+      </w:tr>
+      <w:tr>
+        <w:trPr>
+          <w:trHeight w:val="1247"/>
+        </w:trPr>
+        <w:tc>
+          <w:tcPr>
+            <w:tcW w:type="dxa" w:w="2438"/>
+          </w:tcPr>
+          <w:p>
+            <w:r>
+              <w:rPr>
+                <w:b/>
+                <w:sz w:val="26"/>
+              </w:rPr>
+            </w:r>
+            <w:r>
+              <w:rPr>
+                <w:b/>
+                <w:sz w:val="26"/>
+              </w:rPr>
+              <w:t>5 · MAC</w:t>
+              <w:br/>
+              <w:t>D8-07-B6-9E-03-71</w:t>
+            </w:r>
+          </w:p>
+        </w:tc>
+        <w:tc>
+          <w:tcPr>
+            <w:tcW w:type="dxa" w:w="2438"/>
+          </w:tcPr>
+          <w:p>
+            <w:r>
+              <w:rPr>
+                <w:b/>
+                <w:sz w:val="26"/>
+              </w:rPr>
+            </w:r>
+            <w:r>
+              <w:rPr>
+                <w:b/>
+                <w:sz w:val="26"/>
+              </w:rPr>
+              <w:t>6 · MAC</w:t>
+              <w:br/>
+              <w:t>F0-9F-C2-5A-BB-14</w:t>
+            </w:r>
+          </w:p>
+        </w:tc>
+        <w:tc>
+          <w:tcPr>
+            <w:tcW w:type="dxa" w:w="2438"/>
+          </w:tcPr>
+          <w:p>
+            <w:r>
+              <w:rPr>
+                <w:b/>
+                <w:sz w:val="26"/>
+              </w:rPr>
+            </w:r>
+            <w:r>
+              <w:rPr>
+                <w:b/>
+                <w:sz w:val="26"/>
+              </w:rPr>
+              <w:t>7 · MAC</w:t>
+              <w:br/>
+              <w:t>00-1E-58-C7-6A-2F</w:t>
+            </w:r>
+          </w:p>
+        </w:tc>
+        <w:tc>
+          <w:tcPr>
+            <w:tcW w:type="dxa" w:w="2438"/>
+          </w:tcPr>
+          <w:p>
+            <w:r>
+              <w:rPr>
+                <w:b/>
+                <w:sz w:val="26"/>
+              </w:rPr>
+            </w:r>
+            <w:r>
+              <w:rPr>
+                <w:b/>
+                <w:sz w:val="26"/>
+              </w:rPr>
+              <w:t>8 · MAC</w:t>
+              <w:br/>
+              <w:t>B8-27-EB-30-D4-88</w:t>
+            </w:r>
+          </w:p>
+        </w:tc>
+      </w:tr>
+      <w:tr>
+        <w:trPr>
+          <w:trHeight w:val="1247"/>
+        </w:trPr>
+        <w:tc>
+          <w:tcPr>
+            <w:tcW w:type="dxa" w:w="2438"/>
+          </w:tcPr>
+          <w:p>
+            <w:r>
+              <w:rPr>
+                <w:b/>
+                <w:sz w:val="26"/>
+              </w:rPr>
+            </w:r>
+            <w:r>
+              <w:rPr>
+                <w:b/>
+                <w:sz w:val="26"/>
+              </w:rPr>
+              <w:t>9 · MAC</w:t>
+              <w:br/>
+              <w:t>74-DA-38-E1-0C-5B</w:t>
+            </w:r>
+          </w:p>
+        </w:tc>
+        <w:tc>
+          <w:tcPr>
+            <w:tcW w:type="dxa" w:w="2438"/>
+          </w:tcPr>
+          <w:p>
+            <w:r>
+              <w:rPr>
+                <w:b/>
+                <w:sz w:val="26"/>
+              </w:rPr>
+            </w:r>
+            <w:r>
+              <w:rPr>
+                <w:b/>
+                <w:sz w:val="26"/>
+              </w:rPr>
+              <w:t>10 · MAC</w:t>
+              <w:br/>
+              <w:t>C8-3A-35-77-F2-A6</w:t>
+            </w:r>
+          </w:p>
+        </w:tc>
+        <w:tc>
+          <w:tcPr>
+            <w:tcW w:type="dxa" w:w="2438"/>
+          </w:tcPr>
+          <w:p>
+            <w:r>
+              <w:rPr>
+                <w:b/>
+                <w:sz w:val="26"/>
+              </w:rPr>
+            </w:r>
+            <w:r>
+              <w:rPr>
+                <w:b/>
+                <w:sz w:val="26"/>
+              </w:rPr>
+              <w:t>11 · MAC</w:t>
+              <w:br/>
+              <w:t>50-C7-BF-02-9D-3E</w:t>
+            </w:r>
+          </w:p>
+        </w:tc>
+        <w:tc>
+          <w:tcPr>
+            <w:tcW w:type="dxa" w:w="2438"/>
+          </w:tcPr>
+          <w:p>
+            <w:r>
+              <w:rPr>
+                <w:b/>
+                <w:sz w:val="26"/>
+              </w:rPr>
+            </w:r>
+            <w:r>
+              <w:rPr>
+                <w:b/>
+                <w:sz w:val="26"/>
+              </w:rPr>
+              <w:t>12 · MAC</w:t>
+              <w:br/>
+              <w:t>AC-84-C6-6B-41-D0</w:t>
+            </w:r>
+          </w:p>
+        </w:tc>
+      </w:tr>
+      <w:tr>
+        <w:trPr>
+          <w:trHeight w:val="1247"/>
+        </w:trPr>
+        <w:tc>
+          <w:tcPr>
+            <w:tcW w:type="dxa" w:w="2438"/>
+          </w:tcPr>
+          <w:p>
+            <w:r>
+              <w:rPr>
+                <w:b/>
+                <w:sz w:val="26"/>
+              </w:rPr>
+            </w:r>
+            <w:r>
+              <w:rPr>
+                <w:b/>
+                <w:sz w:val="26"/>
+              </w:rPr>
+              <w:t>13 · MAC</w:t>
+              <w:br/>
+              <w:t>E4-5F-01-8A-27-C9</w:t>
+            </w:r>
+          </w:p>
+        </w:tc>
+        <w:tc>
+          <w:tcPr>
+            <w:tcW w:type="dxa" w:w="2438"/>
+          </w:tcPr>
+          <w:p>
+            <w:r>
+              <w:rPr>
+                <w:b/>
+                <w:sz w:val="26"/>
+              </w:rPr>
+            </w:r>
+            <w:r>
+              <w:rPr>
+                <w:b/>
+                <w:sz w:val="26"/>
+              </w:rPr>
+              <w:t>14 · MAC</w:t>
+              <w:br/>
+              <w:t>18-D6-C7-F3-5E-12</w:t>
+            </w:r>
+          </w:p>
+        </w:tc>
+        <w:tc>
+          <w:tcPr>
+            <w:tcW w:type="dxa" w:w="2438"/>
+          </w:tcPr>
+          <w:p>
+            <w:r>
+              <w:rPr>
+                <w:b/>
+                <w:sz w:val="26"/>
+              </w:rPr>
+            </w:r>
+            <w:r>
+              <w:rPr>
+                <w:b/>
+                <w:sz w:val="26"/>
+              </w:rPr>
+              <w:t>15 · MAC</w:t>
+              <w:br/>
+              <w:t>9C-5C-8E-B4-60-7A</w:t>
+            </w:r>
+          </w:p>
+        </w:tc>
+        <w:tc>
+          <w:tcPr>
+            <w:tcW w:type="dxa" w:w="2438"/>
+          </w:tcPr>
+          <w:p>
+            <w:r>
+              <w:rPr>
+                <w:b/>
+                <w:sz w:val="26"/>
+              </w:rPr>
+            </w:r>
+            <w:r>
+              <w:rPr>
+                <w:b/>
+                <w:sz w:val="26"/>
+              </w:rPr>
+              <w:t>16 · MAC</w:t>
+              <w:br/>
+              <w:t>28-EE-52-0F-A9-C3</w:t>
+            </w:r>
+          </w:p>
+        </w:tc>
+      </w:tr>
+      <w:tr>
+        <w:trPr>
+          <w:trHeight w:val="1247"/>
+        </w:trPr>
+        <w:tc>
+          <w:tcPr>
+            <w:tcW w:type="dxa" w:w="2438"/>
+          </w:tcPr>
+          <w:p>
+            <w:r>
+              <w:rPr>
+                <w:b/>
+                <w:sz w:val="26"/>
+              </w:rPr>
+            </w:r>
+            <w:r>
+              <w:rPr>
+                <w:b/>
+                <w:sz w:val="26"/>
+              </w:rPr>
+              <w:t>17 · MAC</w:t>
+              <w:br/>
+              <w:t>84-16-F9-D2-3B-58</w:t>
+            </w:r>
+          </w:p>
+        </w:tc>
+        <w:tc>
+          <w:tcPr>
+            <w:tcW w:type="dxa" w:w="2438"/>
+          </w:tcPr>
+          <w:p>
+            <w:r>
+              <w:rPr>
+                <w:b/>
+                <w:sz w:val="26"/>
+              </w:rPr>
+            </w:r>
+            <w:r>
+              <w:rPr>
+                <w:b/>
+                <w:sz w:val="26"/>
+              </w:rPr>
+              <w:t>18 · MAC</w:t>
+              <w:br/>
+              <w:t>1C-3B-F3-6E-95-0D</w:t>
+            </w:r>
+          </w:p>
+        </w:tc>
+        <w:tc>
+          <w:tcPr>
+            <w:tcW w:type="dxa" w:w="2438"/>
+          </w:tcPr>
+          <w:p>
+            <w:r>
+              <w:rPr>
+                <w:b/>
+                <w:sz w:val="26"/>
+              </w:rPr>
+            </w:r>
+            <w:r>
+              <w:rPr>
+                <w:b/>
+                <w:sz w:val="26"/>
+              </w:rPr>
+              <w:t>19 · MAC</w:t>
+              <w:br/>
+              <w:t>68-FF-7B-29-C1-E4</w:t>
+            </w:r>
+          </w:p>
+        </w:tc>
+        <w:tc>
+          <w:tcPr>
+            <w:tcW w:type="dxa" w:w="2438"/>
+          </w:tcPr>
+          <w:p>
+            <w:r>
+              <w:rPr>
+                <w:b/>
+                <w:sz w:val="26"/>
+              </w:rPr>
+            </w:r>
+            <w:r>
+              <w:rPr>
+                <w:b/>
+                <w:sz w:val="26"/>
+              </w:rPr>
+              <w:t>20 · MAC</w:t>
+              <w:br/>
+              <w:t>CC-32-E5-A0-74-1B</w:t>
+            </w:r>
+          </w:p>
+        </w:tc>
+      </w:tr>
+    </w:tbl>
     <w:sectPr>
       <w:pgSz w:w="12240" w:h="15840"/>
       <w:pgMar w:top="1134" w:right="1134" w:bottom="1134" w:left="1134" w:header="720" w:footer="720" w:gutter="0"/>

</xml_diff>